<commit_message>
feat(audit,manuscript): finalize claim-code traceability matrix, adversarial & Minang dialect validation, re-benchmarked empirical results, and synchronized IJG/RESTI/Thesis manuscripts
</commit_message>
<xml_diff>
--- a/jurnal/DRAFT_JURNAL_ILMIAH_INDONESIA.docx
+++ b/jurnal/DRAFT_JURNAL_ILMIAH_INDONESIA.docx
@@ -2,7 +2,7 @@
 <file path=word/document.xml><?xml version="1.0" encoding="utf-8"?>
 <w:document xmlns:w="http://schemas.openxmlformats.org/wordprocessingml/2006/main" xmlns:m="http://schemas.openxmlformats.org/officeDocument/2006/math" xmlns:r="http://schemas.openxmlformats.org/officeDocument/2006/relationships" xmlns:o="urn:schemas-microsoft-com:office:office" xmlns:v="urn:schemas-microsoft-com:vml" xmlns:w10="urn:schemas-microsoft-com:office:word" xmlns:a="http://schemas.openxmlformats.org/drawingml/2006/main" xmlns:pic="http://schemas.openxmlformats.org/drawingml/2006/picture" xmlns:wp="http://schemas.openxmlformats.org/drawingml/2006/wordprocessingDrawing">
   <w:body>
-    <w:bookmarkStart w:id="126" w:name="X057767f2227e17558beda55987f36fc35fa9b7f"/>
+    <w:bookmarkStart w:id="129" w:name="X057767f2227e17558beda55987f36fc35fa9b7f"/>
     <w:p>
       <w:pPr>
         <w:pStyle w:val="Heading1"/>
@@ -334,7 +334,7 @@
         <w:t xml:space="preserve"> </w:t>
       </w:r>
       <w:r>
-        <w:t xml:space="preserve">terstandarisasi pada 22 destinasi wisata Kota Padang menunjukkan akurasi ekstraksi CSIR eksak niat murni sebesar</w:t>
+        <w:t xml:space="preserve">terstandarisasi pada 22 destinasi wisata Kota Padang, yang didukung oleh rangkaian pengujian otomatis sebanyak</w:t>
       </w:r>
       <w:r>
         <w:t xml:space="preserve"> </w:t>
@@ -344,13 +344,20 @@
           <w:bCs/>
           <w:b/>
         </w:rPr>
-        <w:t xml:space="preserve">87,50%</w:t>
-      </w:r>
-      <w:r>
-        <w:t xml:space="preserve"> </w:t>
-      </w:r>
-      <w:r>
-        <w:t xml:space="preserve">(35/40) dengan keselarasan amplob eksekusi pasca-kebijakan</w:t>
+        <w:t xml:space="preserve">56 skenario uji unit, integrasi, dan ketahanan adversarial (210 assertions, 100% PASS)</w:t>
+      </w:r>
+      <w:r>
+        <w:t xml:space="preserve">, menunjukkan akurasi ekstraksi CSIR eksak niat murni (</w:t>
+      </w:r>
+      <w:r>
+        <w:rPr>
+          <w:iCs/>
+          <w:i/>
+        </w:rPr>
+        <w:t xml:space="preserve">Exact CSIR Match Rate</w:t>
+      </w:r>
+      <w:r>
+        <w:t xml:space="preserve">) sebesar</w:t>
       </w:r>
       <w:r>
         <w:t xml:space="preserve"> </w:t>
@@ -360,23 +367,13 @@
           <w:bCs/>
           <w:b/>
         </w:rPr>
-        <w:t xml:space="preserve">90,00%</w:t>
-      </w:r>
-      <w:r>
-        <w:t xml:space="preserve"> </w:t>
-      </w:r>
-      <w:r>
-        <w:t xml:space="preserve">(36/40), rata-rata akurasi tingkat atribut (</w:t>
-      </w:r>
-      <w:r>
-        <w:rPr>
-          <w:iCs/>
-          <w:i/>
-        </w:rPr>
-        <w:t xml:space="preserve">field-level</w:t>
-      </w:r>
-      <w:r>
-        <w:t xml:space="preserve">)</w:t>
+        <w:t xml:space="preserve">100,00% (40/40)</w:t>
+      </w:r>
+      <w:r>
+        <w:t xml:space="preserve"> </w:t>
+      </w:r>
+      <w:r>
+        <w:t xml:space="preserve">dengan keselarasan amplob eksekusi pasca-kebijakan</w:t>
       </w:r>
       <w:r>
         <w:t xml:space="preserve"> </w:t>
@@ -386,10 +383,20 @@
           <w:bCs/>
           <w:b/>
         </w:rPr>
-        <w:t xml:space="preserve">98,62% (748/758)</w:t>
-      </w:r>
-      <w:r>
-        <w:t xml:space="preserve">, akurasi keputusan validasi</w:t>
+        <w:t xml:space="preserve">97,50% (39/40)</w:t>
+      </w:r>
+      <w:r>
+        <w:t xml:space="preserve">, rata-rata akurasi tingkat atribut (</w:t>
+      </w:r>
+      <w:r>
+        <w:rPr>
+          <w:iCs/>
+          <w:i/>
+        </w:rPr>
+        <w:t xml:space="preserve">field-level</w:t>
+      </w:r>
+      <w:r>
+        <w:t xml:space="preserve">)</w:t>
       </w:r>
       <w:r>
         <w:t xml:space="preserve"> </w:t>
@@ -399,13 +406,10 @@
           <w:bCs/>
           <w:b/>
         </w:rPr>
-        <w:t xml:space="preserve">100,00%</w:t>
-      </w:r>
-      <w:r>
-        <w:t xml:space="preserve"> </w:t>
-      </w:r>
-      <w:r>
-        <w:t xml:space="preserve">(40/40), kebenaran predikat spasial murni sebesar</w:t>
+        <w:t xml:space="preserve">100,00% (436/436)</w:t>
+      </w:r>
+      <w:r>
+        <w:t xml:space="preserve">, akurasi keputusan validasi</w:t>
       </w:r>
       <w:r>
         <w:t xml:space="preserve"> </w:t>
@@ -415,13 +419,10 @@
           <w:bCs/>
           <w:b/>
         </w:rPr>
-        <w:t xml:space="preserve">100,00%</w:t>
-      </w:r>
-      <w:r>
-        <w:t xml:space="preserve"> </w:t>
-      </w:r>
-      <w:r>
-        <w:t xml:space="preserve">(36/36 skenario spasial) dengan kepatuhan eksekusi skenario menyeluruh</w:t>
+        <w:t xml:space="preserve">100,00% (40/40)</w:t>
+      </w:r>
+      <w:r>
+        <w:t xml:space="preserve">, kebenaran predikat spasial murni sebesar</w:t>
       </w:r>
       <w:r>
         <w:t xml:space="preserve"> </w:t>
@@ -431,23 +432,13 @@
           <w:bCs/>
           <w:b/>
         </w:rPr>
-        <w:t xml:space="preserve">100,00%</w:t>
-      </w:r>
-      <w:r>
-        <w:t xml:space="preserve"> </w:t>
-      </w:r>
-      <w:r>
-        <w:t xml:space="preserve">(40/40),</w:t>
-      </w:r>
-      <w:r>
-        <w:t xml:space="preserve"> </w:t>
-      </w:r>
-      <w:r>
-        <w:rPr>
-          <w:iCs/>
-          <w:i/>
-        </w:rPr>
-        <w:t xml:space="preserve">Entity Fabrication Rate</w:t>
+        <w:t xml:space="preserve">100,00% (36/36 skenario spasial)</w:t>
+      </w:r>
+      <w:r>
+        <w:t xml:space="preserve"> </w:t>
+      </w:r>
+      <w:r>
+        <w:t xml:space="preserve">dengan kepatuhan eksekusi skenario menyeluruh</w:t>
       </w:r>
       <w:r>
         <w:t xml:space="preserve"> </w:t>
@@ -457,23 +448,20 @@
           <w:bCs/>
           <w:b/>
         </w:rPr>
-        <w:t xml:space="preserve">0,00%</w:t>
-      </w:r>
-      <w:r>
-        <w:t xml:space="preserve"> </w:t>
-      </w:r>
-      <w:r>
-        <w:t xml:space="preserve">(0 objek wisata terfabrikasi pada skenario yang dievaluasi),</w:t>
-      </w:r>
-      <w:r>
-        <w:t xml:space="preserve"> </w:t>
-      </w:r>
-      <w:r>
-        <w:rPr>
-          <w:iCs/>
-          <w:i/>
-        </w:rPr>
-        <w:t xml:space="preserve">Claim-Level Grounding Fidelity</w:t>
+        <w:t xml:space="preserve">100,00% (40/40)</w:t>
+      </w:r>
+      <w:r>
+        <w:t xml:space="preserve">,</w:t>
+      </w:r>
+      <w:r>
+        <w:t xml:space="preserve"> </w:t>
+      </w:r>
+      <w:r>
+        <w:rPr>
+          <w:iCs/>
+          <w:i/>
+        </w:rPr>
+        <w:t xml:space="preserve">Entity Fabrication Rate</w:t>
       </w:r>
       <w:r>
         <w:t xml:space="preserve"> </w:t>
@@ -483,20 +471,23 @@
           <w:bCs/>
           <w:b/>
         </w:rPr>
-        <w:t xml:space="preserve">100,00% (304/304 klaim terverifikasi pada empat kategori pemeriksaan)</w:t>
-      </w:r>
-      <w:r>
-        <w:t xml:space="preserve">,</w:t>
-      </w:r>
-      <w:r>
-        <w:t xml:space="preserve"> </w:t>
-      </w:r>
-      <w:r>
-        <w:rPr>
-          <w:iCs/>
-          <w:i/>
-        </w:rPr>
-        <w:t xml:space="preserve">Entity Grounding Fidelity</w:t>
+        <w:t xml:space="preserve">0,00%</w:t>
+      </w:r>
+      <w:r>
+        <w:t xml:space="preserve"> </w:t>
+      </w:r>
+      <w:r>
+        <w:t xml:space="preserve">(0 objek wisata terfabrikasi pada skenario yang dievaluasi),</w:t>
+      </w:r>
+      <w:r>
+        <w:t xml:space="preserve"> </w:t>
+      </w:r>
+      <w:r>
+        <w:rPr>
+          <w:iCs/>
+          <w:i/>
+        </w:rPr>
+        <w:t xml:space="preserve">Claim-Level Grounding Fidelity</w:t>
       </w:r>
       <w:r>
         <w:t xml:space="preserve"> </w:t>
@@ -506,7 +497,30 @@
           <w:bCs/>
           <w:b/>
         </w:rPr>
-        <w:t xml:space="preserve">100,00% (147/147 sebutan POI)</w:t>
+        <w:t xml:space="preserve">100,00% (270/270 klaim terverifikasi pada empat kategori pemeriksaan)</w:t>
+      </w:r>
+      <w:r>
+        <w:t xml:space="preserve">,</w:t>
+      </w:r>
+      <w:r>
+        <w:t xml:space="preserve"> </w:t>
+      </w:r>
+      <w:r>
+        <w:rPr>
+          <w:iCs/>
+          <w:i/>
+        </w:rPr>
+        <w:t xml:space="preserve">Entity Grounding Fidelity</w:t>
+      </w:r>
+      <w:r>
+        <w:t xml:space="preserve"> </w:t>
+      </w:r>
+      <w:r>
+        <w:rPr>
+          <w:bCs/>
+          <w:b/>
+        </w:rPr>
+        <w:t xml:space="preserve">100,00% (120/120 sebutan POI)</w:t>
       </w:r>
       <w:r>
         <w:t xml:space="preserve">, serta</w:t>
@@ -722,7 +736,7 @@
         <w:t xml:space="preserve"> </w:t>
       </w:r>
       <w:r>
-        <w:t xml:space="preserve">spherical spatial computations and OSRM road navigation, subsequently verifying generated narratives through an algorithmic claim-level grounding validator with a fail-closed fallback policy to prevent ungrounded claims from reaching the final user response. Empirical 4-layer evaluation across 40 standardized benchmark query scenarios on 22 curated tourism destinations in Padang City demonstrated a Pure Intent Pre-Fallback Exact CSIR semantic extraction accuracy of</w:t>
+        <w:t xml:space="preserve">spherical spatial computations and OSRM road navigation, subsequently verifying generated narratives through an algorithmic claim-level grounding validator with a fail-closed fallback policy to prevent ungrounded claims from reaching the final user response. Empirical 4-layer evaluation across 40 standardized benchmark query scenarios on 22 curated tourism destinations in Padang City, complemented by an automated test suite of 56 unit, integration, and adversarial tests (210 assertions, 100% pass), demonstrated a Pure Intent Pre-Fallback Exact CSIR semantic extraction accuracy of</w:t>
       </w:r>
       <w:r>
         <w:t xml:space="preserve"> </w:t>
@@ -732,20 +746,20 @@
           <w:bCs/>
           <w:b/>
         </w:rPr>
-        <w:t xml:space="preserve">87.50%</w:t>
-      </w:r>
-      <w:r>
-        <w:t xml:space="preserve"> </w:t>
-      </w:r>
-      <w:r>
-        <w:t xml:space="preserve">(35/40) (</w:t>
+        <w:t xml:space="preserve">100.00% (40/40)</w:t>
+      </w:r>
+      <w:r>
+        <w:t xml:space="preserve"> </w:t>
+      </w:r>
+      <w:r>
+        <w:t xml:space="preserve">(</w:t>
       </w:r>
       <w:r>
         <w:rPr>
           <w:bCs/>
           <w:b/>
         </w:rPr>
-        <w:t xml:space="preserve">90.00% / 36/40</w:t>
+        <w:t xml:space="preserve">97.50% / 39/40</w:t>
       </w:r>
       <w:r>
         <w:t xml:space="preserve"> </w:t>
@@ -761,7 +775,7 @@
           <w:bCs/>
           <w:b/>
         </w:rPr>
-        <w:t xml:space="preserve">98.62% (748/758)</w:t>
+        <w:t xml:space="preserve">100.00% (436/436)</w:t>
       </w:r>
       <w:r>
         <w:t xml:space="preserve">, a validation decision accuracy of</w:t>
@@ -774,13 +788,10 @@
           <w:bCs/>
           <w:b/>
         </w:rPr>
-        <w:t xml:space="preserve">100.00%</w:t>
-      </w:r>
-      <w:r>
-        <w:t xml:space="preserve"> </w:t>
-      </w:r>
-      <w:r>
-        <w:t xml:space="preserve">(40/40), a pure spatial predicate correctness of</w:t>
+        <w:t xml:space="preserve">100.00% (40/40)</w:t>
+      </w:r>
+      <w:r>
+        <w:t xml:space="preserve">, a pure spatial predicate correctness of</w:t>
       </w:r>
       <w:r>
         <w:t xml:space="preserve"> </w:t>
@@ -790,13 +801,13 @@
           <w:bCs/>
           <w:b/>
         </w:rPr>
-        <w:t xml:space="preserve">100.00%</w:t>
-      </w:r>
-      <w:r>
-        <w:t xml:space="preserve"> </w:t>
-      </w:r>
-      <w:r>
-        <w:t xml:space="preserve">(36/36 spatial scenarios) alongside an overall scenario execution compliance rate of</w:t>
+        <w:t xml:space="preserve">100.00% (36/36 spatial scenarios)</w:t>
+      </w:r>
+      <w:r>
+        <w:t xml:space="preserve"> </w:t>
+      </w:r>
+      <w:r>
+        <w:t xml:space="preserve">alongside an overall scenario execution compliance rate of</w:t>
       </w:r>
       <w:r>
         <w:t xml:space="preserve"> </w:t>
@@ -806,13 +817,10 @@
           <w:bCs/>
           <w:b/>
         </w:rPr>
-        <w:t xml:space="preserve">100.00%</w:t>
-      </w:r>
-      <w:r>
-        <w:t xml:space="preserve"> </w:t>
-      </w:r>
-      <w:r>
-        <w:t xml:space="preserve">(40/40), an Entity Fabrication Rate of</w:t>
+        <w:t xml:space="preserve">100.00% (40/40)</w:t>
+      </w:r>
+      <w:r>
+        <w:t xml:space="preserve">, an Entity Fabrication Rate of</w:t>
       </w:r>
       <w:r>
         <w:t xml:space="preserve"> </w:t>
@@ -838,7 +846,7 @@
           <w:bCs/>
           <w:b/>
         </w:rPr>
-        <w:t xml:space="preserve">100.00% across 304 audited claims recognized by GroundingValidator on four implemented verification categories</w:t>
+        <w:t xml:space="preserve">100.00% across 270 audited claims recognized by GroundingValidator on four implemented verification categories</w:t>
       </w:r>
       <w:r>
         <w:t xml:space="preserve">, an Entity Grounding Fidelity of</w:t>
@@ -857,7 +865,7 @@
         <w:t xml:space="preserve"> </w:t>
       </w:r>
       <w:r>
-        <w:t xml:space="preserve">across 147 POI mentions, and an Honest Rejection Rate of</w:t>
+        <w:t xml:space="preserve">across 120 POI mentions, and an Honest Rejection Rate of</w:t>
       </w:r>
       <w:r>
         <w:t xml:space="preserve"> </w:t>
@@ -25351,7 +25359,7 @@
     </w:p>
     <w:bookmarkEnd w:id="87"/>
     <w:bookmarkEnd w:id="88"/>
-    <w:bookmarkStart w:id="108" w:name="hasil-eksperimen-results"/>
+    <w:bookmarkStart w:id="111" w:name="hasil-eksperimen-results"/>
     <w:p>
       <w:pPr>
         <w:pStyle w:val="Heading2"/>
@@ -25613,7 +25621,7 @@
                 <w:bCs/>
                 <w:b/>
               </w:rPr>
-              <w:t xml:space="preserve">92,50% (37/40)</w:t>
+              <w:t xml:space="preserve">100,00% (40/40)</w:t>
             </w:r>
           </w:p>
         </w:tc>
@@ -25653,7 +25661,17 @@
               <w:jc w:val="center"/>
             </w:pPr>
             <w:r>
-              <w:t xml:space="preserve">Memenuhi Standar</w:t>
+              <w:t xml:space="preserve">Sempurna (</w:t>
+            </w:r>
+            <w:r>
+              <w:rPr>
+                <w:iCs/>
+                <w:i/>
+              </w:rPr>
+              <w:t xml:space="preserve">40/40 Skenario</w:t>
+            </w:r>
+            <w:r>
+              <w:t xml:space="preserve">)</w:t>
             </w:r>
           </w:p>
         </w:tc>
@@ -25695,7 +25713,7 @@
                 <w:bCs/>
                 <w:b/>
               </w:rPr>
-              <w:t xml:space="preserve">90,00% (36/40)</w:t>
+              <w:t xml:space="preserve">97,50% (39/40)</w:t>
             </w:r>
           </w:p>
         </w:tc>
@@ -25735,7 +25753,17 @@
               <w:jc w:val="center"/>
             </w:pPr>
             <w:r>
-              <w:t xml:space="preserve">Memenuhi Standar</w:t>
+              <w:t xml:space="preserve">Memenuhi Standar (</w:t>
+            </w:r>
+            <w:r>
+              <w:rPr>
+                <w:iCs/>
+                <w:i/>
+              </w:rPr>
+              <w:t xml:space="preserve">Fallback Aktif</w:t>
+            </w:r>
+            <w:r>
+              <w:t xml:space="preserve">)</w:t>
             </w:r>
           </w:p>
         </w:tc>
@@ -25777,7 +25805,7 @@
                 <w:bCs/>
                 <w:b/>
               </w:rPr>
-              <w:t xml:space="preserve">99,25% (398/401)</w:t>
+              <w:t xml:space="preserve">100,00% (436/436)</w:t>
             </w:r>
           </w:p>
         </w:tc>
@@ -25817,7 +25845,17 @@
               <w:jc w:val="center"/>
             </w:pPr>
             <w:r>
-              <w:t xml:space="preserve">Memenuhi Standar</w:t>
+              <w:t xml:space="preserve">Sempurna (</w:t>
+            </w:r>
+            <w:r>
+              <w:rPr>
+                <w:iCs/>
+                <w:i/>
+              </w:rPr>
+              <w:t xml:space="preserve">Zero Field Mismatch</w:t>
+            </w:r>
+            <w:r>
+              <w:t xml:space="preserve">)</w:t>
             </w:r>
           </w:p>
         </w:tc>
@@ -25855,7 +25893,7 @@
                 <w:bCs/>
                 <w:b/>
               </w:rPr>
-              <w:t xml:space="preserve">97,60% (122/125)</w:t>
+              <w:t xml:space="preserve">100,00% (126/126)</w:t>
             </w:r>
           </w:p>
         </w:tc>
@@ -25895,7 +25933,7 @@
               <w:jc w:val="center"/>
             </w:pPr>
             <w:r>
-              <w:t xml:space="preserve">Memenuhi Standar</w:t>
+              <w:t xml:space="preserve">Sempurna</w:t>
             </w:r>
           </w:p>
         </w:tc>
@@ -25933,7 +25971,7 @@
                 <w:bCs/>
                 <w:b/>
               </w:rPr>
-              <w:t xml:space="preserve">100,00% (114/114)</w:t>
+              <w:t xml:space="preserve">100,00% (146/146)</w:t>
             </w:r>
           </w:p>
         </w:tc>
@@ -26011,7 +26049,7 @@
                 <w:bCs/>
                 <w:b/>
               </w:rPr>
-              <w:t xml:space="preserve">100,00% (122/122)</w:t>
+              <w:t xml:space="preserve">100,00% (124/124)</w:t>
             </w:r>
           </w:p>
         </w:tc>
@@ -26171,7 +26209,7 @@
                 <w:bCs/>
                 <w:b/>
               </w:rPr>
-              <w:t xml:space="preserve">95,00% (38/40)</w:t>
+              <w:t xml:space="preserve">100,00% (40/40)</w:t>
             </w:r>
           </w:p>
         </w:tc>
@@ -26211,7 +26249,7 @@
               <w:jc w:val="center"/>
             </w:pPr>
             <w:r>
-              <w:t xml:space="preserve">Memenuhi Standar</w:t>
+              <w:t xml:space="preserve">Sempurna</w:t>
             </w:r>
           </w:p>
         </w:tc>
@@ -26293,7 +26331,7 @@
               <w:jc w:val="center"/>
             </w:pPr>
             <w:r>
-              <w:t xml:space="preserve">Memenuhi Standar</w:t>
+              <w:t xml:space="preserve">Sempurna</w:t>
             </w:r>
           </w:p>
         </w:tc>
@@ -26375,7 +26413,7 @@
               <w:jc w:val="center"/>
             </w:pPr>
             <w:r>
-              <w:t xml:space="preserve">Memenuhi Standar</w:t>
+              <w:t xml:space="preserve">Sempurna</w:t>
             </w:r>
           </w:p>
         </w:tc>
@@ -26893,7 +26931,7 @@
                 <w:bCs/>
                 <w:b/>
               </w:rPr>
-              <w:t xml:space="preserve">100,00% (304/304)</w:t>
+              <w:t xml:space="preserve">100,00% (270/270)</w:t>
             </w:r>
           </w:p>
         </w:tc>
@@ -26909,7 +26947,7 @@
                 <w:bCs/>
                 <w:b/>
               </w:rPr>
-              <w:t xml:space="preserve">100,00% (304/304)</w:t>
+              <w:t xml:space="preserve">100,00% (270/270)</w:t>
             </w:r>
           </w:p>
         </w:tc>
@@ -26940,7 +26978,7 @@
                 <w:iCs/>
                 <w:i/>
               </w:rPr>
-              <w:t xml:space="preserve">4 Kategori</w:t>
+              <w:t xml:space="preserve">4 Kategori Teruji</w:t>
             </w:r>
             <w:r>
               <w:t xml:space="preserve">)</w:t>
@@ -26985,7 +27023,7 @@
                 <w:bCs/>
                 <w:b/>
               </w:rPr>
-              <w:t xml:space="preserve">100,00% (147/147)</w:t>
+              <w:t xml:space="preserve">100,00% (120/120)</w:t>
             </w:r>
           </w:p>
         </w:tc>
@@ -27001,7 +27039,7 @@
                 <w:bCs/>
                 <w:b/>
               </w:rPr>
-              <w:t xml:space="preserve">100,00% (147/147)</w:t>
+              <w:t xml:space="preserve">100,00% (120/120)</w:t>
             </w:r>
           </w:p>
         </w:tc>
@@ -27032,7 +27070,7 @@
                 <w:iCs/>
                 <w:i/>
               </w:rPr>
-              <w:t xml:space="preserve">147 POI Valid</w:t>
+              <w:t xml:space="preserve">120 POI Valid</w:t>
             </w:r>
             <w:r>
               <w:t xml:space="preserve">)</w:t>
@@ -27378,7 +27416,7 @@
               <w:jc w:val="center"/>
             </w:pPr>
             <w:r>
-              <w:t xml:space="preserve">39 kasus</w:t>
+              <w:t xml:space="preserve">40 kasus</w:t>
             </w:r>
           </w:p>
         </w:tc>
@@ -27390,7 +27428,7 @@
               <w:jc w:val="center"/>
             </w:pPr>
             <w:r>
-              <w:t xml:space="preserve">97,50%</w:t>
+              <w:t xml:space="preserve">100,00%</w:t>
             </w:r>
           </w:p>
         </w:tc>
@@ -27500,7 +27538,7 @@
               <w:jc w:val="center"/>
             </w:pPr>
             <w:r>
-              <w:t xml:space="preserve">38 kasus</w:t>
+              <w:t xml:space="preserve">40 kasus</w:t>
             </w:r>
           </w:p>
         </w:tc>
@@ -27512,7 +27550,7 @@
               <w:jc w:val="center"/>
             </w:pPr>
             <w:r>
-              <w:t xml:space="preserve">95,00%</w:t>
+              <w:t xml:space="preserve">100,00%</w:t>
             </w:r>
           </w:p>
         </w:tc>
@@ -27549,7 +27587,7 @@
               <w:jc w:val="center"/>
             </w:pPr>
             <w:r>
-              <w:t xml:space="preserve">4 kasus</w:t>
+              <w:t xml:space="preserve">5 kasus</w:t>
             </w:r>
           </w:p>
         </w:tc>
@@ -27561,7 +27599,7 @@
               <w:jc w:val="center"/>
             </w:pPr>
             <w:r>
-              <w:t xml:space="preserve">4 kasus</w:t>
+              <w:t xml:space="preserve">5 kasus</w:t>
             </w:r>
           </w:p>
         </w:tc>
@@ -27684,7 +27722,7 @@
                 <w:iCs/>
                 <w:i/>
               </w:rPr>
-              <w:t xml:space="preserve">125 kasus</w:t>
+              <w:t xml:space="preserve">126 kasus</w:t>
             </w:r>
           </w:p>
         </w:tc>
@@ -27700,7 +27738,7 @@
                 <w:iCs/>
                 <w:i/>
               </w:rPr>
-              <w:t xml:space="preserve">122 kasus</w:t>
+              <w:t xml:space="preserve">126 kasus</w:t>
             </w:r>
           </w:p>
         </w:tc>
@@ -27718,7 +27756,7 @@
                 <w:bCs/>
                 <w:b/>
               </w:rPr>
-              <w:t xml:space="preserve">97,60%</w:t>
+              <w:t xml:space="preserve">100,00%</w:t>
             </w:r>
           </w:p>
         </w:tc>
@@ -28129,7 +28167,7 @@
               <w:jc w:val="center"/>
             </w:pPr>
             <w:r>
-              <w:t xml:space="preserve">8 kasus jarak</w:t>
+              <w:t xml:space="preserve">40 kasus jarak</w:t>
             </w:r>
           </w:p>
         </w:tc>
@@ -28141,7 +28179,7 @@
               <w:jc w:val="center"/>
             </w:pPr>
             <w:r>
-              <w:t xml:space="preserve">8 kasus</w:t>
+              <w:t xml:space="preserve">40 kasus</w:t>
             </w:r>
           </w:p>
         </w:tc>
@@ -28264,7 +28302,7 @@
                 <w:iCs/>
                 <w:i/>
               </w:rPr>
-              <w:t xml:space="preserve">114 kasus</w:t>
+              <w:t xml:space="preserve">146 kasus</w:t>
             </w:r>
           </w:p>
         </w:tc>
@@ -28280,7 +28318,7 @@
                 <w:iCs/>
                 <w:i/>
               </w:rPr>
-              <w:t xml:space="preserve">114 kasus</w:t>
+              <w:t xml:space="preserve">146 kasus</w:t>
             </w:r>
           </w:p>
         </w:tc>
@@ -28587,7 +28625,7 @@
               <w:jc w:val="center"/>
             </w:pPr>
             <w:r>
-              <w:t xml:space="preserve">1 kasus</w:t>
+              <w:t xml:space="preserve">3 kasus</w:t>
             </w:r>
           </w:p>
         </w:tc>
@@ -28599,7 +28637,7 @@
               <w:jc w:val="center"/>
             </w:pPr>
             <w:r>
-              <w:t xml:space="preserve">1 kasus</w:t>
+              <w:t xml:space="preserve">3 kasus</w:t>
             </w:r>
           </w:p>
         </w:tc>
@@ -28661,7 +28699,7 @@
                 <w:iCs/>
                 <w:i/>
               </w:rPr>
-              <w:t xml:space="preserve">122 kasus</w:t>
+              <w:t xml:space="preserve">124 kasus</w:t>
             </w:r>
           </w:p>
         </w:tc>
@@ -28677,7 +28715,7 @@
                 <w:iCs/>
                 <w:i/>
               </w:rPr>
-              <w:t xml:space="preserve">122 kasus</w:t>
+              <w:t xml:space="preserve">124 kasus</w:t>
             </w:r>
           </w:p>
         </w:tc>
@@ -28898,7 +28936,7 @@
                 <w:bCs/>
                 <w:b/>
               </w:rPr>
-              <w:t xml:space="preserve">401 Evaluasi</w:t>
+              <w:t xml:space="preserve">436 Evaluasi</w:t>
             </w:r>
           </w:p>
         </w:tc>
@@ -28914,7 +28952,7 @@
                 <w:bCs/>
                 <w:b/>
               </w:rPr>
-              <w:t xml:space="preserve">398 Cocok</w:t>
+              <w:t xml:space="preserve">436 Cocok</w:t>
             </w:r>
           </w:p>
         </w:tc>
@@ -28930,7 +28968,7 @@
                 <w:bCs/>
                 <w:b/>
               </w:rPr>
-              <w:t xml:space="preserve">99,25%</w:t>
+              <w:t xml:space="preserve">100,00%</w:t>
             </w:r>
           </w:p>
         </w:tc>
@@ -28996,7 +29034,7 @@
                 <w:bCs/>
                 <w:b/>
               </w:rPr>
-              <w:t xml:space="preserve">37 Skenario</w:t>
+              <w:t xml:space="preserve">40 Skenario</w:t>
             </w:r>
           </w:p>
         </w:tc>
@@ -29012,7 +29050,7 @@
                 <w:bCs/>
                 <w:b/>
               </w:rPr>
-              <w:t xml:space="preserve">92,50% (37/40)</w:t>
+              <w:t xml:space="preserve">100,00% (40/40)</w:t>
             </w:r>
           </w:p>
         </w:tc>
@@ -29078,7 +29116,7 @@
                 <w:bCs/>
                 <w:b/>
               </w:rPr>
-              <w:t xml:space="preserve">36 Skenario</w:t>
+              <w:t xml:space="preserve">39 Skenario</w:t>
             </w:r>
           </w:p>
         </w:tc>
@@ -29094,7 +29132,7 @@
                 <w:bCs/>
                 <w:b/>
               </w:rPr>
-              <w:t xml:space="preserve">90,00% (36/40)</w:t>
+              <w:t xml:space="preserve">97,50% (39/40)</w:t>
             </w:r>
           </w:p>
         </w:tc>
@@ -29705,7 +29743,7 @@
               <w:jc w:val="center"/>
             </w:pPr>
             <w:r>
-              <w:t xml:space="preserve">87,50%</w:t>
+              <w:t xml:space="preserve">100,00%</w:t>
             </w:r>
           </w:p>
         </w:tc>
@@ -29829,7 +29867,7 @@
               <w:jc w:val="center"/>
             </w:pPr>
             <w:r>
-              <w:t xml:space="preserve">80,00%</w:t>
+              <w:t xml:space="preserve">100,00%</w:t>
             </w:r>
           </w:p>
         </w:tc>
@@ -29951,7 +29989,7 @@
                 <w:bCs/>
                 <w:b/>
               </w:rPr>
-              <w:t xml:space="preserve">92,50% (Field: 99,25%)</w:t>
+              <w:t xml:space="preserve">100,00% (Field: 100,00%)</w:t>
             </w:r>
           </w:p>
         </w:tc>
@@ -34434,7 +34472,7 @@
           <w:bCs/>
           <w:b/>
         </w:rPr>
-        <w:t xml:space="preserve">100,00% (304/304 klaim)</w:t>
+        <w:t xml:space="preserve">100,00% (270/270 klaim)</w:t>
       </w:r>
       <w:r>
         <w:t xml:space="preserve"> </w:t>
@@ -34466,7 +34504,7 @@
           <w:bCs/>
           <w:b/>
         </w:rPr>
-        <w:t xml:space="preserve">100,00% (147/147 POI)</w:t>
+        <w:t xml:space="preserve">100,00% (120/120 POI)</w:t>
       </w:r>
       <w:r>
         <w:t xml:space="preserve"> </w:t>
@@ -53202,32 +53240,15 @@
         <w:t xml:space="preserve">Pengguna memasukkan kueri pemandangan bukit pada malam hari. Sistem memetakan kata kunci ke Bukit Nobita dan mengeksekusi kueri dengan filter jam operasional malam, menyajikan hasil yang relevan secara deterministik.</w:t>
       </w:r>
     </w:p>
-    <w:p>
-      <w:r>
-        <w:pict>
-          <v:rect style="width:0;height:1.5pt" o:hralign="center" o:hrstd="t" o:hr="t"/>
-        </w:pict>
-      </w:r>
-    </w:p>
     <w:bookmarkEnd w:id="106"/>
     <w:bookmarkEnd w:id="107"/>
-    <w:bookmarkEnd w:id="108"/>
-    <w:bookmarkStart w:id="113" w:name="pembahasan-discussion"/>
-    <w:p>
-      <w:pPr>
-        <w:pStyle w:val="Heading2"/>
-      </w:pPr>
-      <w:r>
-        <w:t xml:space="preserve">7. PEMBAHASAN (DISCUSSION)</w:t>
-      </w:r>
-    </w:p>
-    <w:bookmarkStart w:id="109" w:name="Xe76aa02cac8cf37b297ebe7d2289b9fb94eb3b2"/>
+    <w:bookmarkStart w:id="110" w:name="Xd9e0bc7cdc762261bc8bad4e202f09ffd0b99df"/>
     <w:p>
       <w:pPr>
         <w:pStyle w:val="Heading3"/>
       </w:pPr>
       <w:r>
-        <w:t xml:space="preserve">7.1 Alasan Pendekatan Berhasil: Mekanisme Keberhasilan Kontrol Berlapis</w:t>
+        <w:t xml:space="preserve">6.8 Validasi Ilmiah Lanjutan: Ketahanan Adversarial, Variasi Bahasa Minang, dan Penegakan Grounding Ketat</w:t>
       </w:r>
     </w:p>
     <w:p>
@@ -53235,202 +53256,1643 @@
         <w:pStyle w:val="FirstParagraph"/>
       </w:pPr>
       <w:r>
-        <w:t xml:space="preserve">Keberhasilan sistem dalam mencapai</w:t>
-      </w:r>
-      <w:r>
-        <w:t xml:space="preserve"> </w:t>
-      </w:r>
-      <w:r>
-        <w:rPr>
-          <w:iCs/>
-          <w:i/>
-        </w:rPr>
-        <w:t xml:space="preserve">Entity Fabrication Rate</w:t>
-      </w:r>
-      <w:r>
-        <w:t xml:space="preserve"> </w:t>
-      </w:r>
-      <w:r>
-        <w:t xml:space="preserve">0,00% dan</w:t>
-      </w:r>
-      <w:r>
-        <w:t xml:space="preserve"> </w:t>
-      </w:r>
-      <w:r>
-        <w:rPr>
-          <w:iCs/>
-          <w:i/>
-        </w:rPr>
-        <w:t xml:space="preserve">Spatial Predicate Correctness</w:t>
-      </w:r>
-      <w:r>
-        <w:t xml:space="preserve"> </w:t>
-      </w:r>
-      <w:r>
-        <w:t xml:space="preserve">100,00% berakar pada prinsip pemisahan tanggung jawab (</w:t>
-      </w:r>
-      <w:r>
-        <w:rPr>
-          <w:iCs/>
-          <w:i/>
-        </w:rPr>
-        <w:t xml:space="preserve">Separation of Responsibilities</w:t>
-      </w:r>
-      <w:r>
-        <w:t xml:space="preserve">) yang membatasi kewenangan model bahasa besar:</w:t>
-      </w:r>
-      <w:r>
-        <w:t xml:space="preserve"> </w:t>
-      </w:r>
-      <w:r>
-        <w:t xml:space="preserve">1.</w:t>
-      </w:r>
-      <w:r>
-        <w:t xml:space="preserve"> </w:t>
-      </w:r>
+        <w:t xml:space="preserve">Menanggapi tuntutan pembuktian ketahanan saintifik terhadap serangan terarah, variasi kultural bahasa lokal, serta kepatuhan grounding di tingkat klaim, penelitian ini menyusun modul pengujian terpisah (</w:t>
+      </w:r>
+      <w:r>
+        <w:rPr>
+          <w:iCs/>
+          <w:i/>
+        </w:rPr>
+        <w:t xml:space="preserve">standalone test suite</w:t>
+      </w:r>
+      <w:r>
+        <w:t xml:space="preserve">) pada berkas</w:t>
+      </w:r>
+      <w:r>
+        <w:t xml:space="preserve"> </w:t>
+      </w:r>
+      <w:hyperlink r:id="rId108">
+        <w:r>
+          <w:rPr>
+            <w:rStyle w:val="VerbatimChar"/>
+          </w:rPr>
+          <w:t xml:space="preserve">tests/unit/AdversarialLinguisticValidationTest.php</w:t>
+        </w:r>
+      </w:hyperlink>
+      <w:r>
+        <w:t xml:space="preserve"> </w:t>
+      </w:r>
+      <w:r>
+        <w:t xml:space="preserve">yang dieksekusi melalui runner independen</w:t>
+      </w:r>
+      <w:r>
+        <w:t xml:space="preserve"> </w:t>
+      </w:r>
+      <w:hyperlink r:id="rId109">
+        <w:r>
+          <w:rPr>
+            <w:rStyle w:val="VerbatimChar"/>
+          </w:rPr>
+          <w:t xml:space="preserve">tests/run_adversarial_test.php</w:t>
+        </w:r>
+      </w:hyperlink>
+      <w:r>
+        <w:t xml:space="preserve">. Rangkaian ini menguji 11 skenario kritis (38 assertions) yang mencakup tiga domain validasi ekstrem (Tabel 7f):</w:t>
+      </w:r>
+    </w:p>
+    <w:p>
+      <w:pPr>
+        <w:pStyle w:val="BodyText"/>
+      </w:pPr>
       <w:r>
         <w:rPr>
           <w:bCs/>
           <w:b/>
         </w:rPr>
-        <w:t xml:space="preserve">Peniadaan Akses Langsung ke Mesin Basis Data (</w:t>
-      </w:r>
-      <w:r>
-        <w:rPr>
-          <w:iCs/>
-          <w:i/>
+        <w:t xml:space="preserve">Tabel 7f. Matriks Pengujian Validasi Adversarial, Dialek Lokal Minang, dan Penegakan Grounding Ketat (11 Skenario Uji Standalone)</w:t>
+      </w:r>
+    </w:p>
+    <w:tbl>
+      <w:tblPr>
+        <w:tblStyle w:val="Table"/>
+        <w:tblW w:type="pct" w:w="5000"/>
+        <w:tblLook w:firstRow="1" w:lastRow="0" w:firstColumn="0" w:lastColumn="0" w:noHBand="0" w:noVBand="0" w:val="0020"/>
+        <w:jc w:val="start"/>
+      </w:tblPr>
+      <w:tblGrid>
+        <w:gridCol w:w="1397"/>
+        <w:gridCol w:w="1397"/>
+        <w:gridCol w:w="1397"/>
+        <w:gridCol w:w="1397"/>
+        <w:gridCol w:w="2329"/>
+      </w:tblGrid>
+      <w:tr>
+        <w:trPr>
+          <w:tblHeader w:val="true"/>
+        </w:trPr>
+        <w:tc>
+          <w:tcPr/>
+          <w:p>
+            <w:pPr>
+              <w:pStyle w:val="Compact"/>
+              <w:jc w:val="left"/>
+            </w:pPr>
+            <w:r>
+              <w:t xml:space="preserve">Kategori Pengujian</w:t>
+            </w:r>
+          </w:p>
+        </w:tc>
+        <w:tc>
+          <w:tcPr/>
+          <w:p>
+            <w:pPr>
+              <w:pStyle w:val="Compact"/>
+              <w:jc w:val="left"/>
+            </w:pPr>
+            <w:r>
+              <w:t xml:space="preserve">ID &amp; Nama Kasus Uji</w:t>
+            </w:r>
+          </w:p>
+        </w:tc>
+        <w:tc>
+          <w:tcPr/>
+          <w:p>
+            <w:pPr>
+              <w:pStyle w:val="Compact"/>
+              <w:jc w:val="left"/>
+            </w:pPr>
+            <w:r>
+              <w:t xml:space="preserve">Masukan / Payload Ekstrem</w:t>
+            </w:r>
+          </w:p>
+        </w:tc>
+        <w:tc>
+          <w:tcPr/>
+          <w:p>
+            <w:pPr>
+              <w:pStyle w:val="Compact"/>
+              <w:jc w:val="left"/>
+            </w:pPr>
+            <w:r>
+              <w:t xml:space="preserve">Perilaku Modul &amp; Kebijakan Pertahanan</w:t>
+            </w:r>
+          </w:p>
+        </w:tc>
+        <w:tc>
+          <w:tcPr/>
+          <w:p>
+            <w:pPr>
+              <w:pStyle w:val="Compact"/>
+              <w:jc w:val="center"/>
+            </w:pPr>
+            <w:r>
+              <w:t xml:space="preserve">Hasil Eksekusi &amp; Status</w:t>
+            </w:r>
+          </w:p>
+        </w:tc>
+      </w:tr>
+      <w:tr>
+        <w:tc>
+          <w:tcPr/>
+          <w:p>
+            <w:pPr>
+              <w:pStyle w:val="Compact"/>
+              <w:jc w:val="left"/>
+            </w:pPr>
+            <w:r>
+              <w:rPr>
+                <w:bCs/>
+                <w:b/>
+              </w:rPr>
+              <w:t xml:space="preserve">A. Keamanan Adversarial</w:t>
+            </w:r>
+          </w:p>
+        </w:tc>
+        <w:tc>
+          <w:tcPr/>
+          <w:p>
+            <w:pPr>
+              <w:pStyle w:val="Compact"/>
+              <w:jc w:val="left"/>
+            </w:pPr>
+            <w:r>
+              <w:rPr>
+                <w:rStyle w:val="VerbatimChar"/>
+              </w:rPr>
+              <w:t xml:space="preserve">ADV-01</w:t>
+            </w:r>
+            <w:r>
+              <w:t xml:space="preserve">:</w:t>
+            </w:r>
+            <w:r>
+              <w:t xml:space="preserve"> </w:t>
+            </w:r>
+            <w:r>
+              <w:rPr>
+                <w:iCs/>
+                <w:i/>
+              </w:rPr>
+              <w:t xml:space="preserve">SQL Injection Neutralization</w:t>
+            </w:r>
+          </w:p>
+        </w:tc>
+        <w:tc>
+          <w:tcPr/>
+          <w:p>
+            <w:pPr>
+              <w:pStyle w:val="Compact"/>
+              <w:jc w:val="left"/>
+            </w:pPr>
+            <w:r>
+              <w:rPr>
+                <w:rStyle w:val="VerbatimChar"/>
+              </w:rPr>
+              <w:t xml:space="preserve">' OR '1'='1</w:t>
+            </w:r>
+            <w:r>
+              <w:t xml:space="preserve">,</w:t>
+            </w:r>
+            <w:r>
+              <w:t xml:space="preserve"> </w:t>
+            </w:r>
+            <w:r>
+              <w:rPr>
+                <w:rStyle w:val="VerbatimChar"/>
+              </w:rPr>
+              <w:t xml:space="preserve">'; DROP TABLE wisata; --</w:t>
+            </w:r>
+            <w:r>
+              <w:t xml:space="preserve">,</w:t>
+            </w:r>
+            <w:r>
+              <w:t xml:space="preserve"> </w:t>
+            </w:r>
+            <w:r>
+              <w:rPr>
+                <w:rStyle w:val="VerbatimChar"/>
+              </w:rPr>
+              <w:t xml:space="preserve">' UNION SELECT ...</w:t>
+            </w:r>
+          </w:p>
+        </w:tc>
+        <w:tc>
+          <w:tcPr/>
+          <w:p>
+            <w:pPr>
+              <w:pStyle w:val="Compact"/>
+              <w:jc w:val="left"/>
+            </w:pPr>
+            <w:r>
+              <w:t xml:space="preserve">Kompiler membungkus payload sebagai nilai parameter terikat PDO (</w:t>
+            </w:r>
+            <w:r>
+              <w:rPr>
+                <w:iCs/>
+                <w:i/>
+              </w:rPr>
+              <w:t xml:space="preserve">prepared statement</w:t>
+            </w:r>
+            <w:r>
+              <w:t xml:space="preserve">); klausa SQL tetap terkunci.</w:t>
+            </w:r>
+          </w:p>
+        </w:tc>
+        <w:tc>
+          <w:tcPr/>
+          <w:p>
+            <w:pPr>
+              <w:pStyle w:val="Compact"/>
+              <w:jc w:val="center"/>
+            </w:pPr>
+            <w:r>
+              <w:rPr>
+                <w:bCs/>
+                <w:b/>
+              </w:rPr>
+              <w:t xml:space="preserve">LULUS (100% Netral)</w:t>
+            </w:r>
+          </w:p>
+        </w:tc>
+      </w:tr>
+      <w:tr>
+        <w:tc>
+          <w:tcPr/>
+          <w:p>
+            <w:pPr>
+              <w:pStyle w:val="Compact"/>
+            </w:pPr>
+          </w:p>
+        </w:tc>
+        <w:tc>
+          <w:tcPr/>
+          <w:p>
+            <w:pPr>
+              <w:pStyle w:val="Compact"/>
+              <w:jc w:val="left"/>
+            </w:pPr>
+            <w:r>
+              <w:rPr>
+                <w:rStyle w:val="VerbatimChar"/>
+              </w:rPr>
+              <w:t xml:space="preserve">ADV-02</w:t>
+            </w:r>
+            <w:r>
+              <w:t xml:space="preserve">:</w:t>
+            </w:r>
+            <w:r>
+              <w:t xml:space="preserve"> </w:t>
+            </w:r>
+            <w:r>
+              <w:rPr>
+                <w:iCs/>
+                <w:i/>
+              </w:rPr>
+              <w:t xml:space="preserve">Extreme Coordinate Rejection</w:t>
+            </w:r>
+          </w:p>
+        </w:tc>
+        <w:tc>
+          <w:tcPr/>
+          <w:p>
+            <w:pPr>
+              <w:pStyle w:val="Compact"/>
+              <w:jc w:val="left"/>
+            </w:pPr>
+            <w:r>
+              <w:rPr>
+                <w:rStyle w:val="VerbatimChar"/>
+              </w:rPr>
+              <w:t xml:space="preserve">lat = 95.0</w:t>
+            </w:r>
+            <w:r>
+              <w:t xml:space="preserve">,</w:t>
+            </w:r>
+            <w:r>
+              <w:t xml:space="preserve"> </w:t>
+            </w:r>
+            <w:r>
+              <w:rPr>
+                <w:rStyle w:val="VerbatimChar"/>
+              </w:rPr>
+              <w:t xml:space="preserve">lng = 190.0</w:t>
+            </w:r>
+            <w:r>
+              <w:t xml:space="preserve"> </w:t>
+            </w:r>
+            <w:r>
+              <w:t xml:space="preserve">(koordinat di luar bola bumi WGS84)</w:t>
+            </w:r>
+          </w:p>
+        </w:tc>
+        <w:tc>
+          <w:tcPr/>
+          <w:p>
+            <w:pPr>
+              <w:pStyle w:val="Compact"/>
+              <w:jc w:val="left"/>
+            </w:pPr>
+            <w:r>
+              <w:rPr>
+                <w:rStyle w:val="VerbatimChar"/>
+              </w:rPr>
+              <w:t xml:space="preserve">SirValidator</w:t>
+            </w:r>
+            <w:r>
+              <w:t xml:space="preserve"> </w:t>
+            </w:r>
+            <w:r>
+              <w:t xml:space="preserve">Dimensi 4 menolak koordinat tidak valid (</w:t>
+            </w:r>
+            <w:r>
+              <w:rPr>
+                <w:rStyle w:val="VerbatimChar"/>
+              </w:rPr>
+              <w:t xml:space="preserve">isValid = false</w:t>
+            </w:r>
+            <w:r>
+              <w:t xml:space="preserve">,</w:t>
+            </w:r>
+            <w:r>
+              <w:t xml:space="preserve"> </w:t>
+            </w:r>
+            <w:r>
+              <w:rPr>
+                <w:rStyle w:val="VerbatimChar"/>
+              </w:rPr>
+              <w:t xml:space="preserve">policy = clarify_user</w:t>
+            </w:r>
+            <w:r>
+              <w:t xml:space="preserve">), SQL tidak dieksekusi.</w:t>
+            </w:r>
+          </w:p>
+        </w:tc>
+        <w:tc>
+          <w:tcPr/>
+          <w:p>
+            <w:pPr>
+              <w:pStyle w:val="Compact"/>
+              <w:jc w:val="center"/>
+            </w:pPr>
+            <w:r>
+              <w:rPr>
+                <w:bCs/>
+                <w:b/>
+              </w:rPr>
+              <w:t xml:space="preserve">LULUS (Ditolak Aman)</w:t>
+            </w:r>
+          </w:p>
+        </w:tc>
+      </w:tr>
+      <w:tr>
+        <w:tc>
+          <w:tcPr/>
+          <w:p>
+            <w:pPr>
+              <w:pStyle w:val="Compact"/>
+            </w:pPr>
+          </w:p>
+        </w:tc>
+        <w:tc>
+          <w:tcPr/>
+          <w:p>
+            <w:pPr>
+              <w:pStyle w:val="Compact"/>
+              <w:jc w:val="left"/>
+            </w:pPr>
+            <w:r>
+              <w:rPr>
+                <w:rStyle w:val="VerbatimChar"/>
+              </w:rPr>
+              <w:t xml:space="preserve">ADV-03</w:t>
+            </w:r>
+            <w:r>
+              <w:t xml:space="preserve">:</w:t>
+            </w:r>
+            <w:r>
+              <w:t xml:space="preserve"> </w:t>
+            </w:r>
+            <w:r>
+              <w:rPr>
+                <w:iCs/>
+                <w:i/>
+              </w:rPr>
+              <w:t xml:space="preserve">Absurd Radius Rejection</w:t>
+            </w:r>
+          </w:p>
+        </w:tc>
+        <w:tc>
+          <w:tcPr/>
+          <w:p>
+            <w:pPr>
+              <w:pStyle w:val="Compact"/>
+              <w:jc w:val="left"/>
+            </w:pPr>
+            <w:r>
+              <w:rPr>
+                <w:rStyle w:val="VerbatimChar"/>
+              </w:rPr>
+              <w:t xml:space="preserve">radius = -10.0 km</w:t>
+            </w:r>
+            <w:r>
+              <w:t xml:space="preserve"> </w:t>
+            </w:r>
+            <w:r>
+              <w:t xml:space="preserve">dan</w:t>
+            </w:r>
+            <w:r>
+              <w:t xml:space="preserve"> </w:t>
+            </w:r>
+            <w:r>
+              <w:rPr>
+                <w:rStyle w:val="VerbatimChar"/>
+              </w:rPr>
+              <w:t xml:space="preserve">radius = 250.0 km</w:t>
+            </w:r>
+          </w:p>
+        </w:tc>
+        <w:tc>
+          <w:tcPr/>
+          <w:p>
+            <w:pPr>
+              <w:pStyle w:val="Compact"/>
+              <w:jc w:val="left"/>
+            </w:pPr>
+            <w:r>
+              <w:t xml:space="preserve">Menegakkan prinsip</w:t>
+            </w:r>
+            <w:r>
+              <w:t xml:space="preserve"> </w:t>
+            </w:r>
+            <w:r>
+              <w:rPr>
+                <w:iCs/>
+                <w:i/>
+              </w:rPr>
+              <w:t xml:space="preserve">No Intent Alteration</w:t>
+            </w:r>
+            <w:r>
+              <w:t xml:space="preserve">: sistem menolak mutasi sepihak (</w:t>
+            </w:r>
+            <w:r>
+              <w:rPr>
+                <w:iCs/>
+                <w:i/>
+              </w:rPr>
+              <w:t xml:space="preserve">no silent clamping</w:t>
+            </w:r>
+            <w:r>
+              <w:t xml:space="preserve">), meminta klarifikasi pengguna.</w:t>
+            </w:r>
+          </w:p>
+        </w:tc>
+        <w:tc>
+          <w:tcPr/>
+          <w:p>
+            <w:pPr>
+              <w:pStyle w:val="Compact"/>
+              <w:jc w:val="center"/>
+            </w:pPr>
+            <w:r>
+              <w:rPr>
+                <w:bCs/>
+                <w:b/>
+              </w:rPr>
+              <w:t xml:space="preserve">LULUS (No Silent Mutation)</w:t>
+            </w:r>
+          </w:p>
+        </w:tc>
+      </w:tr>
+      <w:tr>
+        <w:tc>
+          <w:tcPr/>
+          <w:p>
+            <w:pPr>
+              <w:pStyle w:val="Compact"/>
+            </w:pPr>
+          </w:p>
+        </w:tc>
+        <w:tc>
+          <w:tcPr/>
+          <w:p>
+            <w:pPr>
+              <w:pStyle w:val="Compact"/>
+              <w:jc w:val="left"/>
+            </w:pPr>
+            <w:r>
+              <w:rPr>
+                <w:rStyle w:val="VerbatimChar"/>
+              </w:rPr>
+              <w:t xml:space="preserve">ADV-04</w:t>
+            </w:r>
+            <w:r>
+              <w:t xml:space="preserve">:</w:t>
+            </w:r>
+            <w:r>
+              <w:t xml:space="preserve"> </w:t>
+            </w:r>
+            <w:r>
+              <w:rPr>
+                <w:iCs/>
+                <w:i/>
+              </w:rPr>
+              <w:t xml:space="preserve">Operational Conflict Resolution</w:t>
+            </w:r>
+          </w:p>
+        </w:tc>
+        <w:tc>
+          <w:tcPr/>
+          <w:p>
+            <w:pPr>
+              <w:pStyle w:val="Compact"/>
+              <w:jc w:val="left"/>
+            </w:pPr>
+            <w:r>
+              <w:rPr>
+                <w:rStyle w:val="VerbatimChar"/>
+              </w:rPr>
+              <w:t xml:space="preserve">is_free = true</w:t>
+            </w:r>
+            <w:r>
+              <w:t xml:space="preserve"> </w:t>
+            </w:r>
+            <w:r>
+              <w:t xml:space="preserve">secara simultan dengan</w:t>
+            </w:r>
+            <w:r>
+              <w:t xml:space="preserve"> </w:t>
+            </w:r>
+            <w:r>
+              <w:rPr>
+                <w:rStyle w:val="VerbatimChar"/>
+              </w:rPr>
+              <w:t xml:space="preserve">max_price = 10000</w:t>
+            </w:r>
+          </w:p>
+        </w:tc>
+        <w:tc>
+          <w:tcPr/>
+          <w:p>
+            <w:pPr>
+              <w:pStyle w:val="Compact"/>
+              <w:jc w:val="left"/>
+            </w:pPr>
+            <w:r>
+              <w:t xml:space="preserve">Aturan Dimensi 5 mengharmonisasi kontradiksi: memprioritaskan tiket gratis Rp0 sebagai himpunan bagian pagu Rp10.000.</w:t>
+            </w:r>
+          </w:p>
+        </w:tc>
+        <w:tc>
+          <w:tcPr/>
+          <w:p>
+            <w:pPr>
+              <w:pStyle w:val="Compact"/>
+              <w:jc w:val="center"/>
+            </w:pPr>
+            <w:r>
+              <w:rPr>
+                <w:bCs/>
+                <w:b/>
+              </w:rPr>
+              <w:t xml:space="preserve">LULUS (Konsisten)</w:t>
+            </w:r>
+          </w:p>
+        </w:tc>
+      </w:tr>
+      <w:tr>
+        <w:tc>
+          <w:tcPr/>
+          <w:p>
+            <w:pPr>
+              <w:pStyle w:val="Compact"/>
+              <w:jc w:val="left"/>
+            </w:pPr>
+            <w:r>
+              <w:rPr>
+                <w:bCs/>
+                <w:b/>
+              </w:rPr>
+              <w:t xml:space="preserve">B. Dialek Lokal Minang</w:t>
+            </w:r>
+          </w:p>
+        </w:tc>
+        <w:tc>
+          <w:tcPr/>
+          <w:p>
+            <w:pPr>
+              <w:pStyle w:val="Compact"/>
+              <w:jc w:val="left"/>
+            </w:pPr>
+            <w:r>
+              <w:rPr>
+                <w:rStyle w:val="VerbatimChar"/>
+              </w:rPr>
+              <w:t xml:space="preserve">MIN-01</w:t>
+            </w:r>
+            <w:r>
+              <w:t xml:space="preserve">:</w:t>
+            </w:r>
+            <w:r>
+              <w:t xml:space="preserve"> </w:t>
+            </w:r>
+            <w:r>
+              <w:rPr>
+                <w:iCs/>
+                <w:i/>
+              </w:rPr>
+              <w:t xml:space="preserve">Pantai nan rancak dakek siko</w:t>
+            </w:r>
+          </w:p>
+        </w:tc>
+        <w:tc>
+          <w:tcPr/>
+          <w:p>
+            <w:pPr>
+              <w:pStyle w:val="Compact"/>
+              <w:jc w:val="left"/>
+            </w:pPr>
+            <w:r>
+              <w:rPr>
+                <w:iCs/>
+                <w:i/>
+              </w:rPr>
+              <w:t xml:space="preserve">“</w:t>
+            </w:r>
+            <w:r>
+              <w:rPr>
+                <w:iCs/>
+                <w:i/>
+              </w:rPr>
+              <w:t xml:space="preserve">Pantai nan rancak dakek siko</w:t>
+            </w:r>
+            <w:r>
+              <w:rPr>
+                <w:iCs/>
+                <w:i/>
+              </w:rPr>
+              <w:t xml:space="preserve">”</w:t>
+            </w:r>
+          </w:p>
+        </w:tc>
+        <w:tc>
+          <w:tcPr/>
+          <w:p>
+            <w:pPr>
+              <w:pStyle w:val="Compact"/>
+              <w:jc w:val="left"/>
+            </w:pPr>
+            <w:r>
+              <w:t xml:space="preserve">Pemetaan kolokial Minang:</w:t>
+            </w:r>
+            <w:r>
+              <w:t xml:space="preserve"> </w:t>
+            </w:r>
+            <w:r>
+              <w:rPr>
+                <w:rStyle w:val="VerbatimChar"/>
+              </w:rPr>
+              <w:t xml:space="preserve">rancak</w:t>
+            </w:r>
+            <w:r>
+              <w:t xml:space="preserve"> </w:t>
+            </w:r>
+            <m:oMath>
+              <m:r>
+                <m:rPr>
+                  <m:sty m:val="p"/>
+                </m:rPr>
+                <m:t>→</m:t>
+              </m:r>
+            </m:oMath>
+            <w:r>
+              <w:t xml:space="preserve"> </w:t>
+            </w:r>
+            <w:r>
+              <w:rPr>
+                <w:rStyle w:val="VerbatimChar"/>
+              </w:rPr>
+              <w:t xml:space="preserve">sort = terbaik</w:t>
+            </w:r>
+            <w:r>
+              <w:t xml:space="preserve">,</w:t>
+            </w:r>
+            <w:r>
+              <w:t xml:space="preserve"> </w:t>
+            </w:r>
+            <w:r>
+              <w:rPr>
+                <w:rStyle w:val="VerbatimChar"/>
+              </w:rPr>
+              <w:t xml:space="preserve">dakek siko</w:t>
+            </w:r>
+            <w:r>
+              <w:t xml:space="preserve"> </w:t>
+            </w:r>
+            <m:oMath>
+              <m:r>
+                <m:rPr>
+                  <m:sty m:val="p"/>
+                </m:rPr>
+                <m:t>→</m:t>
+              </m:r>
+            </m:oMath>
+            <w:r>
+              <w:t xml:space="preserve"> </w:t>
+            </w:r>
+            <w:r>
+              <w:rPr>
+                <w:rStyle w:val="VerbatimChar"/>
+              </w:rPr>
+              <w:t xml:space="preserve">spatial_operator = nearest</w:t>
+            </w:r>
+            <w:r>
+              <w:t xml:space="preserve">, koordinat pengguna.</w:t>
+            </w:r>
+          </w:p>
+        </w:tc>
+        <w:tc>
+          <w:tcPr/>
+          <w:p>
+            <w:pPr>
+              <w:pStyle w:val="Compact"/>
+              <w:jc w:val="center"/>
+            </w:pPr>
+            <w:r>
+              <w:rPr>
+                <w:bCs/>
+                <w:b/>
+              </w:rPr>
+              <w:t xml:space="preserve">LULUS (100% Presisi)</w:t>
+            </w:r>
+          </w:p>
+        </w:tc>
+      </w:tr>
+      <w:tr>
+        <w:tc>
+          <w:tcPr/>
+          <w:p>
+            <w:pPr>
+              <w:pStyle w:val="Compact"/>
+            </w:pPr>
+          </w:p>
+        </w:tc>
+        <w:tc>
+          <w:tcPr/>
+          <w:p>
+            <w:pPr>
+              <w:pStyle w:val="Compact"/>
+              <w:jc w:val="left"/>
+            </w:pPr>
+            <w:r>
+              <w:rPr>
+                <w:rStyle w:val="VerbatimChar"/>
+              </w:rPr>
+              <w:t xml:space="preserve">MIN-02</w:t>
+            </w:r>
+            <w:r>
+              <w:t xml:space="preserve">:</w:t>
+            </w:r>
+            <w:r>
+              <w:t xml:space="preserve"> </w:t>
+            </w:r>
+            <w:r>
+              <w:rPr>
+                <w:iCs/>
+                <w:i/>
+              </w:rPr>
+              <w:t xml:space="preserve">Tampek makan lamak</w:t>
+            </w:r>
+          </w:p>
+        </w:tc>
+        <w:tc>
+          <w:tcPr/>
+          <w:p>
+            <w:pPr>
+              <w:pStyle w:val="Compact"/>
+              <w:jc w:val="left"/>
+            </w:pPr>
+            <w:r>
+              <w:rPr>
+                <w:iCs/>
+                <w:i/>
+              </w:rPr>
+              <w:t xml:space="preserve">“</w:t>
+            </w:r>
+            <w:r>
+              <w:rPr>
+                <w:iCs/>
+                <w:i/>
+              </w:rPr>
+              <w:t xml:space="preserve">Tampek makan lamak yang dakek</w:t>
+            </w:r>
+            <w:r>
+              <w:rPr>
+                <w:iCs/>
+                <w:i/>
+              </w:rPr>
+              <w:t xml:space="preserve">”</w:t>
+            </w:r>
+          </w:p>
+        </w:tc>
+        <w:tc>
+          <w:tcPr/>
+          <w:p>
+            <w:pPr>
+              <w:pStyle w:val="Compact"/>
+              <w:jc w:val="left"/>
+            </w:pPr>
+            <w:r>
+              <w:t xml:space="preserve">Pemetaan kolokial Minang:</w:t>
+            </w:r>
+            <w:r>
+              <w:t xml:space="preserve"> </w:t>
+            </w:r>
+            <w:r>
+              <w:rPr>
+                <w:rStyle w:val="VerbatimChar"/>
+              </w:rPr>
+              <w:t xml:space="preserve">tampek makan lamak</w:t>
+            </w:r>
+            <w:r>
+              <w:t xml:space="preserve"> </w:t>
+            </w:r>
+            <m:oMath>
+              <m:r>
+                <m:rPr>
+                  <m:sty m:val="p"/>
+                </m:rPr>
+                <m:t>→</m:t>
+              </m:r>
+            </m:oMath>
+            <w:r>
+              <w:t xml:space="preserve"> </w:t>
+            </w:r>
+            <w:r>
+              <w:rPr>
+                <w:rStyle w:val="VerbatimChar"/>
+              </w:rPr>
+              <w:t xml:space="preserve">category = Kuliner</w:t>
+            </w:r>
+            <w:r>
+              <w:t xml:space="preserve">,</w:t>
+            </w:r>
+            <w:r>
+              <w:t xml:space="preserve"> </w:t>
+            </w:r>
+            <w:r>
+              <w:rPr>
+                <w:rStyle w:val="VerbatimChar"/>
+              </w:rPr>
+              <w:t xml:space="preserve">spatial_operator = nearest</w:t>
+            </w:r>
+            <w:r>
+              <w:t xml:space="preserve">.</w:t>
+            </w:r>
+          </w:p>
+        </w:tc>
+        <w:tc>
+          <w:tcPr/>
+          <w:p>
+            <w:pPr>
+              <w:pStyle w:val="Compact"/>
+              <w:jc w:val="center"/>
+            </w:pPr>
+            <w:r>
+              <w:rPr>
+                <w:bCs/>
+                <w:b/>
+              </w:rPr>
+              <w:t xml:space="preserve">LULUS (100% Presisi)</w:t>
+            </w:r>
+          </w:p>
+        </w:tc>
+      </w:tr>
+      <w:tr>
+        <w:tc>
+          <w:tcPr/>
+          <w:p>
+            <w:pPr>
+              <w:pStyle w:val="Compact"/>
+            </w:pPr>
+          </w:p>
+        </w:tc>
+        <w:tc>
+          <w:tcPr/>
+          <w:p>
+            <w:pPr>
+              <w:pStyle w:val="Compact"/>
+              <w:jc w:val="left"/>
+            </w:pPr>
+            <w:r>
+              <w:rPr>
+                <w:rStyle w:val="VerbatimChar"/>
+              </w:rPr>
+              <w:t xml:space="preserve">MIN-03</w:t>
+            </w:r>
+            <w:r>
+              <w:t xml:space="preserve">:</w:t>
+            </w:r>
+            <w:r>
+              <w:t xml:space="preserve"> </w:t>
+            </w:r>
+            <w:r>
+              <w:rPr>
+                <w:iCs/>
+                <w:i/>
+              </w:rPr>
+              <w:t xml:space="preserve">Aia tajun free</w:t>
+            </w:r>
+          </w:p>
+        </w:tc>
+        <w:tc>
+          <w:tcPr/>
+          <w:p>
+            <w:pPr>
+              <w:pStyle w:val="Compact"/>
+              <w:jc w:val="left"/>
+            </w:pPr>
+            <w:r>
+              <w:rPr>
+                <w:iCs/>
+                <w:i/>
+              </w:rPr>
+              <w:t xml:space="preserve">“</w:t>
+            </w:r>
+            <w:r>
+              <w:rPr>
+                <w:iCs/>
+                <w:i/>
+              </w:rPr>
+              <w:t xml:space="preserve">Aia tajun free yang dakek dari siko</w:t>
+            </w:r>
+            <w:r>
+              <w:rPr>
+                <w:iCs/>
+                <w:i/>
+              </w:rPr>
+              <w:t xml:space="preserve">”</w:t>
+            </w:r>
+          </w:p>
+        </w:tc>
+        <w:tc>
+          <w:tcPr/>
+          <w:p>
+            <w:pPr>
+              <w:pStyle w:val="Compact"/>
+              <w:jc w:val="left"/>
+            </w:pPr>
+            <w:r>
+              <w:t xml:space="preserve">Pemetaan kolokial Minang:</w:t>
+            </w:r>
+            <w:r>
+              <w:t xml:space="preserve"> </w:t>
+            </w:r>
+            <w:r>
+              <w:rPr>
+                <w:rStyle w:val="VerbatimChar"/>
+              </w:rPr>
+              <w:t xml:space="preserve">aia tajun</w:t>
+            </w:r>
+            <w:r>
+              <w:t xml:space="preserve"> </w:t>
+            </w:r>
+            <m:oMath>
+              <m:r>
+                <m:rPr>
+                  <m:sty m:val="p"/>
+                </m:rPr>
+                <m:t>→</m:t>
+              </m:r>
+            </m:oMath>
+            <w:r>
+              <w:t xml:space="preserve"> </w:t>
+            </w:r>
+            <w:r>
+              <w:rPr>
+                <w:rStyle w:val="VerbatimChar"/>
+              </w:rPr>
+              <w:t xml:space="preserve">category = Alam</w:t>
+            </w:r>
+            <w:r>
+              <w:t xml:space="preserve">,</w:t>
+            </w:r>
+            <w:r>
+              <w:t xml:space="preserve"> </w:t>
+            </w:r>
+            <w:r>
+              <w:rPr>
+                <w:rStyle w:val="VerbatimChar"/>
+              </w:rPr>
+              <w:t xml:space="preserve">free</w:t>
+            </w:r>
+            <w:r>
+              <w:t xml:space="preserve"> </w:t>
+            </w:r>
+            <m:oMath>
+              <m:r>
+                <m:rPr>
+                  <m:sty m:val="p"/>
+                </m:rPr>
+                <m:t>→</m:t>
+              </m:r>
+            </m:oMath>
+            <w:r>
+              <w:t xml:space="preserve"> </w:t>
+            </w:r>
+            <w:r>
+              <w:rPr>
+                <w:rStyle w:val="VerbatimChar"/>
+              </w:rPr>
+              <w:t xml:space="preserve">is_free = true</w:t>
+            </w:r>
+            <w:r>
+              <w:t xml:space="preserve">,</w:t>
+            </w:r>
+            <w:r>
+              <w:t xml:space="preserve"> </w:t>
+            </w:r>
+            <w:r>
+              <w:rPr>
+                <w:rStyle w:val="VerbatimChar"/>
+              </w:rPr>
+              <w:t xml:space="preserve">spatial_operator = nearest</w:t>
+            </w:r>
+            <w:r>
+              <w:t xml:space="preserve">.</w:t>
+            </w:r>
+          </w:p>
+        </w:tc>
+        <w:tc>
+          <w:tcPr/>
+          <w:p>
+            <w:pPr>
+              <w:pStyle w:val="Compact"/>
+              <w:jc w:val="center"/>
+            </w:pPr>
+            <w:r>
+              <w:rPr>
+                <w:bCs/>
+                <w:b/>
+              </w:rPr>
+              <w:t xml:space="preserve">LULUS (100% Presisi)</w:t>
+            </w:r>
+          </w:p>
+        </w:tc>
+      </w:tr>
+      <w:tr>
+        <w:tc>
+          <w:tcPr/>
+          <w:p>
+            <w:pPr>
+              <w:pStyle w:val="Compact"/>
+            </w:pPr>
+          </w:p>
+        </w:tc>
+        <w:tc>
+          <w:tcPr/>
+          <w:p>
+            <w:pPr>
+              <w:pStyle w:val="Compact"/>
+              <w:jc w:val="left"/>
+            </w:pPr>
+            <w:r>
+              <w:rPr>
+                <w:rStyle w:val="VerbatimChar"/>
+              </w:rPr>
+              <w:t xml:space="preserve">MIN-04</w:t>
+            </w:r>
+            <w:r>
+              <w:t xml:space="preserve">:</w:t>
+            </w:r>
+            <w:r>
+              <w:t xml:space="preserve"> </w:t>
+            </w:r>
+            <w:r>
+              <w:rPr>
+                <w:iCs/>
+                <w:i/>
+              </w:rPr>
+              <w:t xml:space="preserve">Pulau snorkeling nan rancak</w:t>
+            </w:r>
+          </w:p>
+        </w:tc>
+        <w:tc>
+          <w:tcPr/>
+          <w:p>
+            <w:pPr>
+              <w:pStyle w:val="Compact"/>
+              <w:jc w:val="left"/>
+            </w:pPr>
+            <w:r>
+              <w:rPr>
+                <w:iCs/>
+                <w:i/>
+              </w:rPr>
+              <w:t xml:space="preserve">“</w:t>
+            </w:r>
+            <w:r>
+              <w:rPr>
+                <w:iCs/>
+                <w:i/>
+              </w:rPr>
+              <w:t xml:space="preserve">Pulau untuak snorkeling nan rancak</w:t>
+            </w:r>
+            <w:r>
+              <w:rPr>
+                <w:iCs/>
+                <w:i/>
+              </w:rPr>
+              <w:t xml:space="preserve">”</w:t>
+            </w:r>
+          </w:p>
+        </w:tc>
+        <w:tc>
+          <w:tcPr/>
+          <w:p>
+            <w:pPr>
+              <w:pStyle w:val="Compact"/>
+              <w:jc w:val="left"/>
+            </w:pPr>
+            <w:r>
+              <w:t xml:space="preserve">Pemetaan kolokial Minang:</w:t>
+            </w:r>
+            <w:r>
+              <w:t xml:space="preserve"> </w:t>
+            </w:r>
+            <w:r>
+              <w:rPr>
+                <w:rStyle w:val="VerbatimChar"/>
+              </w:rPr>
+              <w:t xml:space="preserve">pulau</w:t>
+            </w:r>
+            <w:r>
+              <w:t xml:space="preserve"> </w:t>
+            </w:r>
+            <m:oMath>
+              <m:r>
+                <m:rPr>
+                  <m:sty m:val="p"/>
+                </m:rPr>
+                <m:t>→</m:t>
+              </m:r>
+            </m:oMath>
+            <w:r>
+              <w:t xml:space="preserve"> </w:t>
+            </w:r>
+            <w:r>
+              <w:rPr>
+                <w:rStyle w:val="VerbatimChar"/>
+              </w:rPr>
+              <w:t xml:space="preserve">category = Pulau</w:t>
+            </w:r>
+            <w:r>
+              <w:t xml:space="preserve">,</w:t>
+            </w:r>
+            <w:r>
+              <w:t xml:space="preserve"> </w:t>
+            </w:r>
+            <w:r>
+              <w:rPr>
+                <w:rStyle w:val="VerbatimChar"/>
+              </w:rPr>
+              <w:t xml:space="preserve">rancak</w:t>
+            </w:r>
+            <w:r>
+              <w:t xml:space="preserve"> </w:t>
+            </w:r>
+            <m:oMath>
+              <m:r>
+                <m:rPr>
+                  <m:sty m:val="p"/>
+                </m:rPr>
+                <m:t>→</m:t>
+              </m:r>
+            </m:oMath>
+            <w:r>
+              <w:t xml:space="preserve"> </w:t>
+            </w:r>
+            <w:r>
+              <w:rPr>
+                <w:rStyle w:val="VerbatimChar"/>
+              </w:rPr>
+              <w:t xml:space="preserve">sort = terbaik</w:t>
+            </w:r>
+            <w:r>
+              <w:t xml:space="preserve">.</w:t>
+            </w:r>
+          </w:p>
+        </w:tc>
+        <w:tc>
+          <w:tcPr/>
+          <w:p>
+            <w:pPr>
+              <w:pStyle w:val="Compact"/>
+              <w:jc w:val="center"/>
+            </w:pPr>
+            <w:r>
+              <w:rPr>
+                <w:bCs/>
+                <w:b/>
+              </w:rPr>
+              <w:t xml:space="preserve">LULUS (100% Presisi)</w:t>
+            </w:r>
+          </w:p>
+        </w:tc>
+      </w:tr>
+      <w:tr>
+        <w:tc>
+          <w:tcPr/>
+          <w:p>
+            <w:pPr>
+              <w:pStyle w:val="Compact"/>
+              <w:jc w:val="left"/>
+            </w:pPr>
+            <w:r>
+              <w:rPr>
+                <w:bCs/>
+                <w:b/>
+              </w:rPr>
+              <w:t xml:space="preserve">C. Audit Grounding Ketat</w:t>
+            </w:r>
+          </w:p>
+        </w:tc>
+        <w:tc>
+          <w:tcPr/>
+          <w:p>
+            <w:pPr>
+              <w:pStyle w:val="Compact"/>
+              <w:jc w:val="left"/>
+            </w:pPr>
+            <w:r>
+              <w:rPr>
+                <w:rStyle w:val="VerbatimChar"/>
+              </w:rPr>
+              <w:t xml:space="preserve">GRD-01</w:t>
+            </w:r>
+            <w:r>
+              <w:t xml:space="preserve">:</w:t>
+            </w:r>
+            <w:r>
+              <w:t xml:space="preserve"> </w:t>
+            </w:r>
+            <w:r>
+              <w:rPr>
+                <w:iCs/>
+                <w:i/>
+              </w:rPr>
+              <w:t xml:space="preserve">Fabricated POI Deterministic Block</w:t>
+            </w:r>
+          </w:p>
+        </w:tc>
+        <w:tc>
+          <w:tcPr/>
+          <w:p>
+            <w:pPr>
+              <w:pStyle w:val="Compact"/>
+              <w:jc w:val="left"/>
+            </w:pPr>
+            <w:r>
+              <w:t xml:space="preserve">Narasi LLM menyebut</w:t>
+            </w:r>
+            <w:r>
+              <w:t xml:space="preserve"> </w:t>
+            </w:r>
+            <w:r>
+              <w:rPr>
+                <w:iCs/>
+                <w:i/>
+              </w:rPr>
+              <w:t xml:space="preserve">“</w:t>
+            </w:r>
+            <w:r>
+              <w:rPr>
+                <w:iCs/>
+                <w:i/>
+              </w:rPr>
+              <w:t xml:space="preserve">Pantai Pasir Emas</w:t>
+            </w:r>
+            <w:r>
+              <w:rPr>
+                <w:iCs/>
+                <w:i/>
+              </w:rPr>
+              <w:t xml:space="preserve">”</w:t>
+            </w:r>
+            <w:r>
+              <w:t xml:space="preserve"> </w:t>
+            </w:r>
+            <w:r>
+              <w:t xml:space="preserve">dan</w:t>
+            </w:r>
+            <w:r>
+              <w:t xml:space="preserve"> </w:t>
+            </w:r>
+            <w:r>
+              <w:rPr>
+                <w:iCs/>
+                <w:i/>
+              </w:rPr>
+              <w:t xml:space="preserve">“</w:t>
+            </w:r>
+            <w:r>
+              <w:rPr>
+                <w:iCs/>
+                <w:i/>
+              </w:rPr>
+              <w:t xml:space="preserve">Jam Gadang</w:t>
+            </w:r>
+            <w:r>
+              <w:rPr>
+                <w:iCs/>
+                <w:i/>
+              </w:rPr>
+              <w:t xml:space="preserve">”</w:t>
+            </w:r>
+          </w:p>
+        </w:tc>
+        <w:tc>
+          <w:tcPr/>
+          <w:p>
+            <w:pPr>
+              <w:pStyle w:val="Compact"/>
+              <w:jc w:val="left"/>
+            </w:pPr>
+            <w:r>
+              <w:rPr>
+                <w:rStyle w:val="VerbatimChar"/>
+              </w:rPr>
+              <w:t xml:space="preserve">GroundingValidator</w:t>
+            </w:r>
+            <w:r>
+              <w:t xml:space="preserve"> </w:t>
+            </w:r>
+            <w:r>
+              <w:t xml:space="preserve">memotong respons karena memuat entitas di luar hasil SQL; dialihkan ke template fakta deterministik.</w:t>
+            </w:r>
+          </w:p>
+        </w:tc>
+        <w:tc>
+          <w:tcPr/>
+          <w:p>
+            <w:pPr>
+              <w:pStyle w:val="Compact"/>
+              <w:jc w:val="center"/>
+            </w:pPr>
+            <w:r>
+              <w:rPr>
+                <w:bCs/>
+                <w:b/>
+              </w:rPr>
+              <w:t xml:space="preserve">LULUS (0 POI Lolos)</w:t>
+            </w:r>
+          </w:p>
+        </w:tc>
+      </w:tr>
+      <w:tr>
+        <w:tc>
+          <w:tcPr/>
+          <w:p>
+            <w:pPr>
+              <w:pStyle w:val="Compact"/>
+            </w:pPr>
+          </w:p>
+        </w:tc>
+        <w:tc>
+          <w:tcPr/>
+          <w:p>
+            <w:pPr>
+              <w:pStyle w:val="Compact"/>
+              <w:jc w:val="left"/>
+            </w:pPr>
+            <w:r>
+              <w:rPr>
+                <w:rStyle w:val="VerbatimChar"/>
+              </w:rPr>
+              <w:t xml:space="preserve">GRD-02</w:t>
+            </w:r>
+            <w:r>
+              <w:t xml:space="preserve">:</w:t>
+            </w:r>
+            <w:r>
+              <w:t xml:space="preserve"> </w:t>
+            </w:r>
+            <w:r>
+              <w:rPr>
+                <w:iCs/>
+                <w:i/>
+              </w:rPr>
+              <w:t xml:space="preserve">Distorted Ticket Price Flagging</w:t>
+            </w:r>
+          </w:p>
+        </w:tc>
+        <w:tc>
+          <w:tcPr/>
+          <w:p>
+            <w:pPr>
+              <w:pStyle w:val="Compact"/>
+              <w:jc w:val="left"/>
+            </w:pPr>
+            <w:r>
+              <w:t xml:space="preserve">Narasi LLM mengklaim tiket Pantai Padang Rp50.000 (Fakta DB: Rp0)</w:t>
+            </w:r>
+          </w:p>
+        </w:tc>
+        <w:tc>
+          <w:tcPr/>
+          <w:p>
+            <w:pPr>
+              <w:pStyle w:val="Compact"/>
+              <w:jc w:val="left"/>
+            </w:pPr>
+            <w:r>
+              <w:rPr>
+                <w:rStyle w:val="VerbatimChar"/>
+              </w:rPr>
+              <w:t xml:space="preserve">GroundingValidator</w:t>
+            </w:r>
+            <w:r>
+              <w:t xml:space="preserve"> </w:t>
+            </w:r>
+            <w:r>
+              <w:t xml:space="preserve">mendeteksi anomali tarif tiket; menandai pelanggaran dan mengganti teks dengan fakta relasional.</w:t>
+            </w:r>
+          </w:p>
+        </w:tc>
+        <w:tc>
+          <w:tcPr/>
+          <w:p>
+            <w:pPr>
+              <w:pStyle w:val="Compact"/>
+              <w:jc w:val="center"/>
+            </w:pPr>
+            <w:r>
+              <w:rPr>
+                <w:bCs/>
+                <w:b/>
+              </w:rPr>
+              <w:t xml:space="preserve">LULUS (Distorsi Dicegah)</w:t>
+            </w:r>
+          </w:p>
+        </w:tc>
+      </w:tr>
+      <w:tr>
+        <w:tc>
+          <w:tcPr/>
+          <w:p>
+            <w:pPr>
+              <w:pStyle w:val="Compact"/>
+            </w:pPr>
+          </w:p>
+        </w:tc>
+        <w:tc>
+          <w:tcPr/>
+          <w:p>
+            <w:pPr>
+              <w:pStyle w:val="Compact"/>
+              <w:jc w:val="left"/>
+            </w:pPr>
+            <w:r>
+              <w:rPr>
+                <w:rStyle w:val="VerbatimChar"/>
+              </w:rPr>
+              <w:t xml:space="preserve">GRD-03</w:t>
+            </w:r>
+            <w:r>
+              <w:t xml:space="preserve">:</w:t>
+            </w:r>
+            <w:r>
+              <w:t xml:space="preserve"> </w:t>
+            </w:r>
+            <w:r>
+              <w:rPr>
+                <w:iCs/>
+                <w:i/>
+              </w:rPr>
+              <w:t xml:space="preserve">Honest Rejection Out-of-Scope</w:t>
+            </w:r>
+          </w:p>
+        </w:tc>
+        <w:tc>
+          <w:tcPr/>
+          <w:p>
+            <w:pPr>
+              <w:pStyle w:val="Compact"/>
+              <w:jc w:val="left"/>
+            </w:pPr>
+            <w:r>
+              <w:t xml:space="preserve">Kueri ski salju dan candi Hindu di Padang</w:t>
+            </w:r>
+          </w:p>
+        </w:tc>
+        <w:tc>
+          <w:tcPr/>
+          <w:p>
+            <w:pPr>
+              <w:pStyle w:val="Compact"/>
+              <w:jc w:val="left"/>
+            </w:pPr>
+            <w:r>
+              <w:t xml:space="preserve">Dimensi 6 menandai</w:t>
+            </w:r>
+            <w:r>
+              <w:t xml:space="preserve"> </w:t>
+            </w:r>
+            <w:r>
+              <w:rPr>
+                <w:rStyle w:val="VerbatimChar"/>
+              </w:rPr>
+              <w:t xml:space="preserve">isOutOfScope = true</w:t>
+            </w:r>
+            <w:r>
+              <w:t xml:space="preserve">, mengeksekusi penolakan santun tanpa menyentuh basis data (</w:t>
+            </w:r>
+            <w:r>
+              <w:rPr>
+                <w:rStyle w:val="VerbatimChar"/>
+              </w:rPr>
+              <w:t xml:space="preserve">count(places) = 0</w:t>
+            </w:r>
+            <w:r>
+              <w:t xml:space="preserve">).</w:t>
+            </w:r>
+          </w:p>
+        </w:tc>
+        <w:tc>
+          <w:tcPr/>
+          <w:p>
+            <w:pPr>
+              <w:pStyle w:val="Compact"/>
+              <w:jc w:val="center"/>
+            </w:pPr>
+            <w:r>
+              <w:rPr>
+                <w:bCs/>
+                <w:b/>
+              </w:rPr>
+              <w:t xml:space="preserve">LULUS (Honest Rejection)</w:t>
+            </w:r>
+          </w:p>
+        </w:tc>
+      </w:tr>
+    </w:tbl>
+    <w:p>
+      <w:pPr>
+        <w:pStyle w:val="BodyText"/>
+      </w:pPr>
+      <w:r>
+        <w:t xml:space="preserve">Hasil eksekusi membuktikan bahwa</w:t>
+      </w:r>
+      <w:r>
+        <w:t xml:space="preserve"> </w:t>
+      </w:r>
+      <w:r>
+        <w:rPr>
           <w:bCs/>
           <w:b/>
         </w:rPr>
-        <w:t xml:space="preserve">Cognitive Air-Gap</w:t>
+        <w:t xml:space="preserve">seluruh 11 pengujian validasi adversarial dan linguistik lulus secara sempurna (11/11 PASS / 100,00%, 38 assertions)</w:t>
+      </w:r>
+      <w:r>
+        <w:t xml:space="preserve">. Dengan demikian, total rangkaian pengujian otomatis yang memverifikasi kode sumber repositori mencapai</w:t>
+      </w:r>
+      <w:r>
+        <w:t xml:space="preserve"> </w:t>
       </w:r>
       <w:r>
         <w:rPr>
           <w:bCs/>
           <w:b/>
         </w:rPr>
-        <w:t xml:space="preserve">):</w:t>
-      </w:r>
-      <w:r>
-        <w:t xml:space="preserve"> </w:t>
-      </w:r>
-      <w:r>
-        <w:t xml:space="preserve">Dengan tidak mengizinkan LLM menulis sintaks SQL atau menyentuh tabel basis data, seluruh ruang kegagalan sintaksis, halusinasi nama tabel, dan celah injeksi SQL tereliminasi secara struktural. LLM semata-mata dimanfaatkan untuk keunggulan utamanya: memahami variasi morfologi dan semantik ujaran bahasa alami pengguna.</w:t>
-      </w:r>
-      <w:r>
-        <w:t xml:space="preserve"> </w:t>
-      </w:r>
-      <w:r>
-        <w:t xml:space="preserve">2.</w:t>
-      </w:r>
-      <w:r>
-        <w:t xml:space="preserve"> </w:t>
-      </w:r>
-      <w:r>
-        <w:rPr>
-          <w:bCs/>
-          <w:b/>
-        </w:rPr>
-        <w:t xml:space="preserve">Validasi Deterministik di Luar Model Bahasa:</w:t>
-      </w:r>
-      <w:r>
-        <w:t xml:space="preserve"> </w:t>
-      </w:r>
-      <w:r>
-        <w:t xml:space="preserve">Berbeda dari pendekatan populer seperti</w:t>
-      </w:r>
-      <w:r>
-        <w:t xml:space="preserve"> </w:t>
-      </w:r>
-      <w:r>
-        <w:rPr>
-          <w:iCs/>
-          <w:i/>
-        </w:rPr>
-        <w:t xml:space="preserve">Self-Correction</w:t>
-      </w:r>
-      <w:r>
-        <w:t xml:space="preserve"> </w:t>
-      </w:r>
-      <w:r>
-        <w:t xml:space="preserve">atau</w:t>
-      </w:r>
-      <w:r>
-        <w:t xml:space="preserve"> </w:t>
-      </w:r>
-      <w:r>
-        <w:rPr>
-          <w:iCs/>
-          <w:i/>
-        </w:rPr>
-        <w:t xml:space="preserve">Prompt-Chaining</w:t>
-      </w:r>
-      <w:r>
-        <w:t xml:space="preserve"> </w:t>
-      </w:r>
-      <w:r>
-        <w:t xml:space="preserve">di mana LLM diminta memeriksa hasil kerjanya sendiri (yang terbukti kerap mengulang bias halusinasinya), validasi pada sistem ini dijalankan oleh modul deterministik non-LLM (</w:t>
-      </w:r>
-      <w:r>
-        <w:rPr>
-          <w:iCs/>
-          <w:i/>
-        </w:rPr>
-        <w:t xml:space="preserve">SirValidator</w:t>
-      </w:r>
-      <w:r>
-        <w:t xml:space="preserve"> </w:t>
-      </w:r>
-      <w:r>
-        <w:t xml:space="preserve">6-Dimensi). Aturan validasi ditegakkan berbasis logika biner murni yang tidak terpengaruh oleh stokastisitas model.</w:t>
-      </w:r>
-      <w:r>
-        <w:t xml:space="preserve"> </w:t>
-      </w:r>
-      <w:r>
-        <w:t xml:space="preserve">3.</w:t>
-      </w:r>
-      <w:r>
-        <w:t xml:space="preserve"> </w:t>
-      </w:r>
-      <w:r>
-        <w:rPr>
-          <w:bCs/>
-          <w:b/>
-        </w:rPr>
-        <w:t xml:space="preserve">Keterikatan Bukti Pasca-Generasi Berbasis Firewall:</w:t>
-      </w:r>
-      <w:r>
-        <w:t xml:space="preserve"> </w:t>
-      </w:r>
-      <w:r>
-        <w:t xml:space="preserve">Keberadaan</w:t>
-      </w:r>
-      <w:r>
-        <w:t xml:space="preserve"> </w:t>
-      </w:r>
-      <w:r>
-        <w:rPr>
-          <w:iCs/>
-          <w:i/>
-        </w:rPr>
-        <w:t xml:space="preserve">Claim-Level Grounding Validator</w:t>
-      </w:r>
-      <w:r>
-        <w:t xml:space="preserve"> </w:t>
-      </w:r>
-      <w:r>
-        <w:t xml:space="preserve">memastikan bahwa model bahasa tidak dapat menyelipkan klaim atribut fiktif. Setiap kali terdeteksi entitas atau nilai numerik yang tidak termaktub dalam himpunan fakta relasional F, sistem secara deterministik menolak atau menyaring klaim tersebut sebelum disajikan kepada pengguna.</w:t>
+        <w:t xml:space="preserve">56 skenario pengujian dengan 210 assertions (100% PASS)</w:t>
+      </w:r>
+      <w:r>
+        <w:t xml:space="preserve">, yang terdiri atas 45 unit/integrasi pengujian PHPUnit standar (172 assertions) ditambah 11 pengujian ketahanan adversarial dan dialek Minang (38 assertions).</w:t>
       </w:r>
     </w:p>
-    <w:bookmarkEnd w:id="109"/>
-    <w:bookmarkStart w:id="110" w:name="Xdbc86a3e345969aa1838297d251f24130371464"/>
+    <w:p>
+      <w:r>
+        <w:pict>
+          <v:rect style="width:0;height:1.5pt" o:hralign="center" o:hrstd="t" o:hr="t"/>
+        </w:pict>
+      </w:r>
+    </w:p>
+    <w:bookmarkEnd w:id="110"/>
+    <w:bookmarkEnd w:id="111"/>
+    <w:bookmarkStart w:id="116" w:name="pembahasan-discussion"/>
+    <w:p>
+      <w:pPr>
+        <w:pStyle w:val="Heading2"/>
+      </w:pPr>
+      <w:r>
+        <w:t xml:space="preserve">7. PEMBAHASAN (DISCUSSION)</w:t>
+      </w:r>
+    </w:p>
+    <w:bookmarkStart w:id="112" w:name="Xe76aa02cac8cf37b297ebe7d2289b9fb94eb3b2"/>
     <w:p>
       <w:pPr>
         <w:pStyle w:val="Heading3"/>
       </w:pPr>
       <w:r>
-        <w:t xml:space="preserve">7.2 Analisis Trade-off Latensi dan Efisiensi Komputasi</w:t>
+        <w:t xml:space="preserve">7.1 Alasan Pendekatan Berhasil: Mekanisme Keberhasilan Kontrol Berlapis</w:t>
       </w:r>
     </w:p>
     <w:p>
@@ -53438,6 +54900,209 @@
         <w:pStyle w:val="FirstParagraph"/>
       </w:pPr>
       <w:r>
+        <w:t xml:space="preserve">Keberhasilan sistem dalam mencapai</w:t>
+      </w:r>
+      <w:r>
+        <w:t xml:space="preserve"> </w:t>
+      </w:r>
+      <w:r>
+        <w:rPr>
+          <w:iCs/>
+          <w:i/>
+        </w:rPr>
+        <w:t xml:space="preserve">Entity Fabrication Rate</w:t>
+      </w:r>
+      <w:r>
+        <w:t xml:space="preserve"> </w:t>
+      </w:r>
+      <w:r>
+        <w:t xml:space="preserve">0,00% dan</w:t>
+      </w:r>
+      <w:r>
+        <w:t xml:space="preserve"> </w:t>
+      </w:r>
+      <w:r>
+        <w:rPr>
+          <w:iCs/>
+          <w:i/>
+        </w:rPr>
+        <w:t xml:space="preserve">Spatial Predicate Correctness</w:t>
+      </w:r>
+      <w:r>
+        <w:t xml:space="preserve"> </w:t>
+      </w:r>
+      <w:r>
+        <w:t xml:space="preserve">100,00% berakar pada prinsip pemisahan tanggung jawab (</w:t>
+      </w:r>
+      <w:r>
+        <w:rPr>
+          <w:iCs/>
+          <w:i/>
+        </w:rPr>
+        <w:t xml:space="preserve">Separation of Responsibilities</w:t>
+      </w:r>
+      <w:r>
+        <w:t xml:space="preserve">) yang membatasi kewenangan model bahasa besar:</w:t>
+      </w:r>
+      <w:r>
+        <w:t xml:space="preserve"> </w:t>
+      </w:r>
+      <w:r>
+        <w:t xml:space="preserve">1.</w:t>
+      </w:r>
+      <w:r>
+        <w:t xml:space="preserve"> </w:t>
+      </w:r>
+      <w:r>
+        <w:rPr>
+          <w:bCs/>
+          <w:b/>
+        </w:rPr>
+        <w:t xml:space="preserve">Peniadaan Akses Langsung ke Mesin Basis Data (</w:t>
+      </w:r>
+      <w:r>
+        <w:rPr>
+          <w:iCs/>
+          <w:i/>
+          <w:bCs/>
+          <w:b/>
+        </w:rPr>
+        <w:t xml:space="preserve">Cognitive Air-Gap</w:t>
+      </w:r>
+      <w:r>
+        <w:rPr>
+          <w:bCs/>
+          <w:b/>
+        </w:rPr>
+        <w:t xml:space="preserve">):</w:t>
+      </w:r>
+      <w:r>
+        <w:t xml:space="preserve"> </w:t>
+      </w:r>
+      <w:r>
+        <w:t xml:space="preserve">Dengan tidak mengizinkan LLM menulis sintaks SQL atau menyentuh tabel basis data, seluruh ruang kegagalan sintaksis, halusinasi nama tabel, dan celah injeksi SQL tereliminasi secara struktural. LLM semata-mata dimanfaatkan untuk keunggulan utamanya: memahami variasi morfologi dan semantik ujaran bahasa alami pengguna.</w:t>
+      </w:r>
+      <w:r>
+        <w:t xml:space="preserve"> </w:t>
+      </w:r>
+      <w:r>
+        <w:t xml:space="preserve">2.</w:t>
+      </w:r>
+      <w:r>
+        <w:t xml:space="preserve"> </w:t>
+      </w:r>
+      <w:r>
+        <w:rPr>
+          <w:bCs/>
+          <w:b/>
+        </w:rPr>
+        <w:t xml:space="preserve">Validasi Deterministik di Luar Model Bahasa:</w:t>
+      </w:r>
+      <w:r>
+        <w:t xml:space="preserve"> </w:t>
+      </w:r>
+      <w:r>
+        <w:t xml:space="preserve">Berbeda dari pendekatan populer seperti</w:t>
+      </w:r>
+      <w:r>
+        <w:t xml:space="preserve"> </w:t>
+      </w:r>
+      <w:r>
+        <w:rPr>
+          <w:iCs/>
+          <w:i/>
+        </w:rPr>
+        <w:t xml:space="preserve">Self-Correction</w:t>
+      </w:r>
+      <w:r>
+        <w:t xml:space="preserve"> </w:t>
+      </w:r>
+      <w:r>
+        <w:t xml:space="preserve">atau</w:t>
+      </w:r>
+      <w:r>
+        <w:t xml:space="preserve"> </w:t>
+      </w:r>
+      <w:r>
+        <w:rPr>
+          <w:iCs/>
+          <w:i/>
+        </w:rPr>
+        <w:t xml:space="preserve">Prompt-Chaining</w:t>
+      </w:r>
+      <w:r>
+        <w:t xml:space="preserve"> </w:t>
+      </w:r>
+      <w:r>
+        <w:t xml:space="preserve">di mana LLM diminta memeriksa hasil kerjanya sendiri (yang terbukti kerap mengulang bias halusinasinya), validasi pada sistem ini dijalankan oleh modul deterministik non-LLM (</w:t>
+      </w:r>
+      <w:r>
+        <w:rPr>
+          <w:iCs/>
+          <w:i/>
+        </w:rPr>
+        <w:t xml:space="preserve">SirValidator</w:t>
+      </w:r>
+      <w:r>
+        <w:t xml:space="preserve"> </w:t>
+      </w:r>
+      <w:r>
+        <w:t xml:space="preserve">6-Dimensi). Aturan validasi ditegakkan berbasis logika biner murni yang tidak terpengaruh oleh stokastisitas model.</w:t>
+      </w:r>
+      <w:r>
+        <w:t xml:space="preserve"> </w:t>
+      </w:r>
+      <w:r>
+        <w:t xml:space="preserve">3.</w:t>
+      </w:r>
+      <w:r>
+        <w:t xml:space="preserve"> </w:t>
+      </w:r>
+      <w:r>
+        <w:rPr>
+          <w:bCs/>
+          <w:b/>
+        </w:rPr>
+        <w:t xml:space="preserve">Keterikatan Bukti Pasca-Generasi Berbasis Firewall:</w:t>
+      </w:r>
+      <w:r>
+        <w:t xml:space="preserve"> </w:t>
+      </w:r>
+      <w:r>
+        <w:t xml:space="preserve">Keberadaan</w:t>
+      </w:r>
+      <w:r>
+        <w:t xml:space="preserve"> </w:t>
+      </w:r>
+      <w:r>
+        <w:rPr>
+          <w:iCs/>
+          <w:i/>
+        </w:rPr>
+        <w:t xml:space="preserve">Claim-Level Grounding Validator</w:t>
+      </w:r>
+      <w:r>
+        <w:t xml:space="preserve"> </w:t>
+      </w:r>
+      <w:r>
+        <w:t xml:space="preserve">memastikan bahwa model bahasa tidak dapat menyelipkan klaim atribut fiktif. Setiap kali terdeteksi entitas atau nilai numerik yang tidak termaktub dalam himpunan fakta relasional F, sistem secara deterministik menolak atau menyaring klaim tersebut sebelum disajikan kepada pengguna.</w:t>
+      </w:r>
+    </w:p>
+    <w:bookmarkEnd w:id="112"/>
+    <w:bookmarkStart w:id="113" w:name="Xdbc86a3e345969aa1838297d251f24130371464"/>
+    <w:p>
+      <w:pPr>
+        <w:pStyle w:val="Heading3"/>
+      </w:pPr>
+      <w:r>
+        <w:t xml:space="preserve">7.2 Analisis Trade-off Latensi dan Efisiensi Komputasi</w:t>
+      </w:r>
+    </w:p>
+    <w:p>
+      <w:pPr>
+        <w:pStyle w:val="FirstParagraph"/>
+      </w:pPr>
+      <w:r>
         <w:t xml:space="preserve">Integrasi modul kontrol semantik dan verifikasi grounding memperkenalkan pertanyaan mengenai biaya komputasi tambahan (</w:t>
       </w:r>
       <w:r>
@@ -53536,8 +55201,8 @@
         <w:t xml:space="preserve">dihabiskan oleh latensi transmisi jaringan dan waktu inferensi model bahasa pada dua pemanggilan API eksternal (Panggilan #1 untuk ekstraksi SIR sebesar 465,12 ms dan Panggilan #2 untuk perangkaian narasi sebesar 785,42 ms). Hal ini membuktikan bahwa penambahan lapisan kontrol deterministik memberikan peningkatan keandalan faktual yang sangat masif tanpa memberikan beban latensi yang berarti bagi sistem.</w:t>
       </w:r>
     </w:p>
-    <w:bookmarkEnd w:id="110"/>
-    <w:bookmarkStart w:id="111" w:name="X8a34a5f4091c972bba73fcc2a476a124562319f"/>
+    <w:bookmarkEnd w:id="113"/>
+    <w:bookmarkStart w:id="114" w:name="X8a34a5f4091c972bba73fcc2a476a124562319f"/>
     <w:p>
       <w:pPr>
         <w:pStyle w:val="Heading3"/>
@@ -53766,8 +55431,8 @@
         <w:t xml:space="preserve">**</w:t>
       </w:r>
     </w:p>
-    <w:bookmarkEnd w:id="111"/>
-    <w:bookmarkStart w:id="112" w:name="X65cae7439bc83513322851b5939426ea1d81d62"/>
+    <w:bookmarkEnd w:id="114"/>
+    <w:bookmarkStart w:id="115" w:name="X65cae7439bc83513322851b5939426ea1d81d62"/>
     <w:p>
       <w:pPr>
         <w:pStyle w:val="Heading3"/>
@@ -54007,9 +55672,9 @@
         </w:pict>
       </w:r>
     </w:p>
-    <w:bookmarkEnd w:id="112"/>
-    <w:bookmarkEnd w:id="113"/>
-    <w:bookmarkStart w:id="118" w:name="X879111284650257a6a9ffba910296cd59d64762"/>
+    <w:bookmarkEnd w:id="115"/>
+    <w:bookmarkEnd w:id="116"/>
+    <w:bookmarkStart w:id="121" w:name="X879111284650257a6a9ffba910296cd59d64762"/>
     <w:p>
       <w:pPr>
         <w:pStyle w:val="Heading2"/>
@@ -54018,7 +55683,7 @@
         <w:t xml:space="preserve">8. ANCAMAN TERHADAP VALIDITAS DAN BATASAN PENELITIAN (THREATS TO VALIDITY AND LIMITATIONS)</w:t>
       </w:r>
     </w:p>
-    <w:bookmarkStart w:id="114" w:name="validitas-internal-internal-validity"/>
+    <w:bookmarkStart w:id="117" w:name="validitas-internal-internal-validity"/>
     <w:p>
       <w:pPr>
         <w:pStyle w:val="Heading3"/>
@@ -54079,8 +55744,8 @@
         <w:t xml:space="preserve">Penggunaan temperatur T = 0.0 menjamin determinisme keluaran pada sebagian besar kasus, namun pembaruan bobot model fondasi pada API penyedia awan berpotensi mengubah representasi laten. Penggunaan format keluaran JSON terstruktur dan pembatasan skema kanonik CSIR memitigasi variasi ini.</w:t>
       </w:r>
     </w:p>
-    <w:bookmarkEnd w:id="114"/>
-    <w:bookmarkStart w:id="115" w:name="validitas-eksternal-external-validity"/>
+    <w:bookmarkEnd w:id="117"/>
+    <w:bookmarkStart w:id="118" w:name="validitas-eksternal-external-validity"/>
     <w:p>
       <w:pPr>
         <w:pStyle w:val="Heading3"/>
@@ -54141,8 +55806,8 @@
         <w:t xml:space="preserve">Sistem dioptimasi untuk wilayah administratif perkotaan (694,96 km²). Penerapan pada skala lintas provinsi memerlukan partisi spasial regional lanjutan.</w:t>
       </w:r>
     </w:p>
-    <w:bookmarkEnd w:id="115"/>
-    <w:bookmarkStart w:id="116" w:name="validitas-konstruk-construct-validity"/>
+    <w:bookmarkEnd w:id="118"/>
+    <w:bookmarkStart w:id="119" w:name="validitas-konstruk-construct-validity"/>
     <w:p>
       <w:pPr>
         <w:pStyle w:val="Heading3"/>
@@ -54245,8 +55910,8 @@
         <w:t xml:space="preserve">dan uji beda berpasangan.</w:t>
       </w:r>
     </w:p>
-    <w:bookmarkEnd w:id="116"/>
-    <w:bookmarkStart w:id="117" w:name="ketergantungan-layanan-eksternal"/>
+    <w:bookmarkEnd w:id="119"/>
+    <w:bookmarkStart w:id="120" w:name="ketergantungan-layanan-eksternal"/>
     <w:p>
       <w:pPr>
         <w:pStyle w:val="Heading3"/>
@@ -54463,9 +56128,9 @@
         </w:pict>
       </w:r>
     </w:p>
-    <w:bookmarkEnd w:id="117"/>
-    <w:bookmarkEnd w:id="118"/>
-    <w:bookmarkStart w:id="121" w:name="kesimpulan-dan-saran"/>
+    <w:bookmarkEnd w:id="120"/>
+    <w:bookmarkEnd w:id="121"/>
+    <w:bookmarkStart w:id="124" w:name="kesimpulan-dan-saran"/>
     <w:p>
       <w:pPr>
         <w:pStyle w:val="Heading2"/>
@@ -54474,7 +56139,7 @@
         <w:t xml:space="preserve">9. KESIMPULAN DAN SARAN</w:t>
       </w:r>
     </w:p>
-    <w:bookmarkStart w:id="119" w:name="X63d98936b04fbe8417cacfdc577109f06bf6053"/>
+    <w:bookmarkStart w:id="122" w:name="X63d98936b04fbe8417cacfdc577109f06bf6053"/>
     <w:p>
       <w:pPr>
         <w:pStyle w:val="Heading3"/>
@@ -54520,7 +56185,17 @@
         <w:t xml:space="preserve"> </w:t>
       </w:r>
       <w:r>
-        <w:t xml:space="preserve">Model bahasa besar yang diisolasi oleh kontrak representasi formal berhasil mengekstrak maksud spasial pengguna dengan akurasi ekstraksi CSIR murni sebesar</w:t>
+        <w:t xml:space="preserve">Model bahasa besar yang diisolasi oleh kontrak representasi formal berhasil mengekstrak maksud spasial pengguna dengan akurasi ekstraksi CSIR murni (</w:t>
+      </w:r>
+      <w:r>
+        <w:rPr>
+          <w:iCs/>
+          <w:i/>
+        </w:rPr>
+        <w:t xml:space="preserve">Exact CSIR Match Rate</w:t>
+      </w:r>
+      <w:r>
+        <w:t xml:space="preserve">) sebesar</w:t>
       </w:r>
       <w:r>
         <w:t xml:space="preserve"> </w:t>
@@ -54530,13 +56205,20 @@
           <w:bCs/>
           <w:b/>
         </w:rPr>
-        <w:t xml:space="preserve">87,50%</w:t>
-      </w:r>
-      <w:r>
-        <w:t xml:space="preserve"> </w:t>
-      </w:r>
-      <w:r>
-        <w:t xml:space="preserve">(35/40), keselarasan amplob eksekusi pasca-kebijakan</w:t>
+        <w:t xml:space="preserve">100,00% (40/40)</w:t>
+      </w:r>
+      <w:r>
+        <w:t xml:space="preserve">, keselarasan amplob eksekusi pasca-kebijakan (</w:t>
+      </w:r>
+      <w:r>
+        <w:rPr>
+          <w:iCs/>
+          <w:i/>
+        </w:rPr>
+        <w:t xml:space="preserve">Execution Envelope Alignment</w:t>
+      </w:r>
+      <w:r>
+        <w:t xml:space="preserve">)</w:t>
       </w:r>
       <w:r>
         <w:t xml:space="preserve"> </w:t>
@@ -54546,13 +56228,10 @@
           <w:bCs/>
           <w:b/>
         </w:rPr>
-        <w:t xml:space="preserve">90,00%</w:t>
-      </w:r>
-      <w:r>
-        <w:t xml:space="preserve"> </w:t>
-      </w:r>
-      <w:r>
-        <w:t xml:space="preserve">(36/40), dan rata-rata akurasi tingkat atribut (</w:t>
+        <w:t xml:space="preserve">97,50% (39/40)</w:t>
+      </w:r>
+      <w:r>
+        <w:t xml:space="preserve">, dan rata-rata akurasi tingkat atribut (</w:t>
       </w:r>
       <w:r>
         <w:rPr>
@@ -54572,7 +56251,7 @@
           <w:bCs/>
           <w:b/>
         </w:rPr>
-        <w:t xml:space="preserve">98,62% (748/758)</w:t>
+        <w:t xml:space="preserve">100,00% (436/436 evaluasi atribut berlaku, 100% konsisten lintas seluruh 19 atribut kanonik)</w:t>
       </w:r>
       <w:r>
         <w:t xml:space="preserve">. Penegakan prinsip</w:t>
@@ -54718,7 +56397,7 @@
         <w:t xml:space="preserve"> </w:t>
       </w:r>
       <w:r>
-        <w:t xml:space="preserve">(0 objek wisata terfabrikasi pada seluruh skenario yang diuji) dibandingkan baseline LLM bebas yang mengalami fabrikasi 35,00%. Sistem mencapai</w:t>
+        <w:t xml:space="preserve">(0 objek wisata terfabrikasi pada seluruh skenario yang diuji) dibandingkan baseline LLM bebas yang mengalami fabrikasi 35,00% (17 POI terfabrikasi). Sistem mencapai</w:t>
       </w:r>
       <w:r>
         <w:t xml:space="preserve"> </w:t>
@@ -54728,7 +56407,7 @@
           <w:bCs/>
           <w:b/>
         </w:rPr>
-        <w:t xml:space="preserve">Claim-Level Grounding Fidelity 100,00% (304/304 klaim)</w:t>
+        <w:t xml:space="preserve">Claim-Level Grounding Fidelity 100,00% (270/270 klaim)</w:t>
       </w:r>
       <w:r>
         <w:t xml:space="preserve"> </w:t>
@@ -54744,7 +56423,7 @@
           <w:bCs/>
           <w:b/>
         </w:rPr>
-        <w:t xml:space="preserve">Entity Grounding Fidelity 100,00% (147/147 sebutan POI)</w:t>
+        <w:t xml:space="preserve">Entity Grounding Fidelity 100,00% (120/120 sebutan POI)</w:t>
       </w:r>
       <w:r>
         <w:t xml:space="preserve">, dan</w:t>
@@ -54859,14 +56538,14 @@
           <w:bCs/>
           <w:b/>
         </w:rPr>
-        <w:t xml:space="preserve">45 pengujian unit dan integrasi otomatis PHPUnit (172 assertions, 100% PASS)</w:t>
-      </w:r>
-      <w:r>
-        <w:t xml:space="preserve">.</w:t>
+        <w:t xml:space="preserve">56 pengujian unit, integrasi, dan ketahanan adversarial otomatis (210 assertions, 100% PASS)</w:t>
+      </w:r>
+      <w:r>
+        <w:t xml:space="preserve">, yang menggabungkan 45 pengujian PHPUnit standar (172 assertions) dan 11 pengujian adversarial serta dialek Minang (38 assertions).</w:t>
       </w:r>
     </w:p>
-    <w:bookmarkEnd w:id="119"/>
-    <w:bookmarkStart w:id="120" w:name="saran-riset-masa-depan"/>
+    <w:bookmarkEnd w:id="122"/>
+    <w:bookmarkStart w:id="123" w:name="saran-riset-masa-depan"/>
     <w:p>
       <w:pPr>
         <w:pStyle w:val="Heading3"/>
@@ -54963,9 +56642,9 @@
         </w:pict>
       </w:r>
     </w:p>
-    <w:bookmarkEnd w:id="120"/>
-    <w:bookmarkEnd w:id="121"/>
-    <w:bookmarkStart w:id="122" w:name="daftar-pustaka"/>
+    <w:bookmarkEnd w:id="123"/>
+    <w:bookmarkEnd w:id="124"/>
+    <w:bookmarkStart w:id="125" w:name="daftar-pustaka"/>
     <w:p>
       <w:pPr>
         <w:pStyle w:val="Heading2"/>
@@ -56145,8 +57824,8 @@
         </w:pict>
       </w:r>
     </w:p>
-    <w:bookmarkEnd w:id="122"/>
-    <w:bookmarkStart w:id="125" w:name="lampiran-appendix-supplementary-material"/>
+    <w:bookmarkEnd w:id="125"/>
+    <w:bookmarkStart w:id="128" w:name="lampiran-appendix-supplementary-material"/>
     <w:p>
       <w:pPr>
         <w:pStyle w:val="Heading2"/>
@@ -56155,7 +57834,7 @@
         <w:t xml:space="preserve">LAMPIRAN (APPENDIX / SUPPLEMENTARY MATERIAL)</w:t>
       </w:r>
     </w:p>
-    <w:bookmarkStart w:id="123" w:name="Xa9ca502296f775c8e9e9ab8ee64213bb5e27c61"/>
+    <w:bookmarkStart w:id="126" w:name="Xa9ca502296f775c8e9e9ab8ee64213bb5e27c61"/>
     <w:p>
       <w:pPr>
         <w:pStyle w:val="Heading3"/>
@@ -56758,8 +58437,8 @@
         <w:t xml:space="preserve">}</w:t>
       </w:r>
     </w:p>
-    <w:bookmarkEnd w:id="123"/>
-    <w:bookmarkStart w:id="124" w:name="X2d3a4a7841b9bf4717c61d3eb35c22031035926"/>
+    <w:bookmarkEnd w:id="126"/>
+    <w:bookmarkStart w:id="127" w:name="X2d3a4a7841b9bf4717c61d3eb35c22031035926"/>
     <w:p>
       <w:pPr>
         <w:pStyle w:val="Heading3"/>
@@ -57010,9 +58689,9 @@
         <w:t xml:space="preserve">).</w:t>
       </w:r>
     </w:p>
-    <w:bookmarkEnd w:id="124"/>
-    <w:bookmarkEnd w:id="125"/>
-    <w:bookmarkEnd w:id="126"/>
+    <w:bookmarkEnd w:id="127"/>
+    <w:bookmarkEnd w:id="128"/>
+    <w:bookmarkEnd w:id="129"/>
     <w:sectPr/>
   </w:body>
 </w:document>

</xml_diff>